<commit_message>
Revise manuscript positioning and replicate methods
</commit_message>
<xml_diff>
--- a/manuscript/main.docx
+++ b/manuscript/main.docx
@@ -26,6 +26,23 @@
       <w:r>
         <w:br/>
       </w:r>
+      <m:oMath>
+        <m:sSup>
+          <m:e>
+            <m:r>
+              <m:t>​</m:t>
+            </m:r>
+          </m:e>
+          <m:sup>
+            <m:r>
+              <m:t>1</m:t>
+            </m:r>
+          </m:sup>
+        </m:sSup>
+      </m:oMath>
+      <w:r>
+        <w:t xml:space="preserve"> </w:t>
+      </w:r>
       <w:r>
         <w:t xml:space="preserve">Department of Oncology, Lombardi Comprehensive Cancer Center, Georgetown University Medical Center, Georgetown University, Washington, DC, USA; yl814@georgetown.edu (Y.L.); cy232@georgetown.edu (C.Y.)</w:t>
       </w:r>
@@ -38,7 +55,38 @@
     </w:p>
     <w:p>
       <w:pPr>
-        <w:pStyle w:val="AbstractTitle"/>
+        <w:pStyle w:val="FirstParagraph"/>
+      </w:pPr>
+      <w:r>
+        <w:rPr>
+          <w:b/>
+          <w:bCs/>
+        </w:rPr>
+        <w:t xml:space="preserve">fp-tools: A Reproducible Platform for ATAC-seq Footprinting and Regulatory Motif Analysis</w:t>
+      </w:r>
+      <w:r>
+        <w:br/>
+      </w:r>
+      <w:r>
+        <w:t xml:space="preserve">Yaoxiang Li and Chunling Yi</w:t>
+      </w:r>
+      <w:r>
+        <w:br/>
+      </w:r>
+      <w:r>
+        <w:t xml:space="preserve">Department of Oncology, Lombardi Comprehensive Cancer Center, Georgetown University Medical Center, Georgetown University, Washington, DC, USA</w:t>
+      </w:r>
+      <w:r>
+        <w:br/>
+      </w:r>
+      <w:r>
+        <w:t xml:space="preserve">Correspondence: cy232@georgetown.edu (C.Y.)</w:t>
+      </w:r>
+    </w:p>
+    <w:bookmarkStart w:id="9" w:name="abstract"/>
+    <w:p>
+      <w:pPr>
+        <w:pStyle w:val="Heading1"/>
       </w:pPr>
       <w:r>
         <w:t xml:space="preserve">Abstract</w:t>
@@ -46,7 +94,7 @@
     </w:p>
     <w:p>
       <w:pPr>
-        <w:pStyle w:val="Abstract"/>
+        <w:pStyle w:val="FirstParagraph"/>
       </w:pPr>
       <w:r>
         <w:t xml:space="preserve">ATAC-seq footprinting enables near-base-resolution inference of</w:t>
@@ -213,7 +261,7 @@
     </w:p>
     <w:p>
       <w:pPr>
-        <w:pStyle w:val="FirstParagraph"/>
+        <w:pStyle w:val="BodyText"/>
       </w:pPr>
       <w:r>
         <w:rPr>
@@ -241,7 +289,8 @@
         <w:t xml:space="preserve">replicate-aware reporting; reproducibility; command-line bioinformatics</w:t>
       </w:r>
     </w:p>
-    <w:bookmarkStart w:id="9" w:name="introduction"/>
+    <w:bookmarkEnd w:id="9"/>
+    <w:bookmarkStart w:id="10" w:name="introduction"/>
     <w:p>
       <w:pPr>
         <w:pStyle w:val="Heading1"/>
@@ -662,35 +711,23 @@
         <w:t xml:space="preserve"> </w:t>
       </w:r>
       <w:r>
-        <w:t xml:space="preserve">position the package as an accessible extension of established ATAC-seq</w:t>
-      </w:r>
-      <w:r>
-        <w:t xml:space="preserve"> </w:t>
-      </w:r>
-      <w:r>
-        <w:t xml:space="preserve">footprinting practice: it does not replace specialized single-cell,</w:t>
-      </w:r>
-      <w:r>
-        <w:t xml:space="preserve"> </w:t>
-      </w:r>
-      <w:r>
-        <w:t xml:space="preserve">deep-learning, or motif-discovery tools, but connects common TF-footprinting</w:t>
-      </w:r>
-      <w:r>
-        <w:t xml:space="preserve"> </w:t>
-      </w:r>
-      <w:r>
-        <w:t xml:space="preserve">tasks into one auditable workflow that can be run from the command line, saved</w:t>
-      </w:r>
-      <w:r>
-        <w:t xml:space="preserve"> </w:t>
-      </w:r>
-      <w:r>
-        <w:t xml:space="preserve">YAML files, or the GUI.</w:t>
-      </w:r>
-    </w:p>
-    <w:bookmarkEnd w:id="9"/>
-    <w:bookmarkStart w:id="17" w:name="materials-and-methods"/>
+        <w:t xml:space="preserve">focus on practical improvements to established ATAC-seq footprinting: connecting</w:t>
+      </w:r>
+      <w:r>
+        <w:t xml:space="preserve"> </w:t>
+      </w:r>
+      <w:r>
+        <w:t xml:space="preserve">common TF-footprinting tasks into one auditable analysis that can be run from the</w:t>
+      </w:r>
+      <w:r>
+        <w:t xml:space="preserve"> </w:t>
+      </w:r>
+      <w:r>
+        <w:t xml:space="preserve">command line, saved YAML files, or the GUI.</w:t>
+      </w:r>
+    </w:p>
+    <w:bookmarkEnd w:id="10"/>
+    <w:bookmarkStart w:id="18" w:name="materials-and-methods"/>
     <w:p>
       <w:pPr>
         <w:pStyle w:val="Heading1"/>
@@ -699,7 +736,7 @@
         <w:t xml:space="preserve">Materials and Methods</w:t>
       </w:r>
     </w:p>
-    <w:bookmarkStart w:id="10" w:name="package-architecture-and-core-workflows"/>
+    <w:bookmarkStart w:id="11" w:name="package-architecture-and-core-workflows"/>
     <w:p>
       <w:pPr>
         <w:pStyle w:val="Heading2"/>
@@ -722,43 +759,49 @@
         <w:t xml:space="preserve"> </w:t>
       </w:r>
       <w:r>
-        <w:t xml:space="preserve">implements performance-critical signal operations with</w:t>
-      </w:r>
-      <w:r>
-        <w:t xml:space="preserve"> </w:t>
-      </w:r>
-      <w:r>
-        <w:t xml:space="preserve">Cython-backed routines. The main analysis steps are Tn5 sequence-bias correction,</w:t>
-      </w:r>
-      <w:r>
-        <w:t xml:space="preserve"> </w:t>
-      </w:r>
-      <w:r>
-        <w:t xml:space="preserve">footprint scoring over corrected signal, motif-anchored differential analysis,</w:t>
-      </w:r>
-      <w:r>
-        <w:t xml:space="preserve"> </w:t>
-      </w:r>
-      <w:r>
-        <w:t xml:space="preserve">and aggregate visualization around TFBS or region sets. These steps share region,</w:t>
-      </w:r>
-      <w:r>
-        <w:t xml:space="preserve"> </w:t>
-      </w:r>
-      <w:r>
-        <w:t xml:space="preserve">signal, motif, and sample-label conventions, so outputs from one command can be</w:t>
-      </w:r>
-      <w:r>
-        <w:t xml:space="preserve"> </w:t>
-      </w:r>
-      <w:r>
-        <w:t xml:space="preserve">used directly by the next. YAML configuration files provide a reproducible way to</w:t>
-      </w:r>
-      <w:r>
-        <w:t xml:space="preserve"> </w:t>
-      </w:r>
-      <w:r>
-        <w:t xml:space="preserve">save and rerun the same analysis without changing the underlying methods.</w:t>
+        <w:t xml:space="preserve">accelerates the main signal-processing steps used in ATAC-seq</w:t>
+      </w:r>
+      <w:r>
+        <w:t xml:space="preserve"> </w:t>
+      </w:r>
+      <w:r>
+        <w:t xml:space="preserve">footprinting. The core analysis includes Tn5 sequence-bias correction, footprint</w:t>
+      </w:r>
+      <w:r>
+        <w:t xml:space="preserve"> </w:t>
+      </w:r>
+      <w:r>
+        <w:t xml:space="preserve">scoring over corrected signal, motif-anchored differential analysis, and</w:t>
+      </w:r>
+      <w:r>
+        <w:t xml:space="preserve"> </w:t>
+      </w:r>
+      <w:r>
+        <w:t xml:space="preserve">aggregate visualization around TFBS or region sets. These steps use shared</w:t>
+      </w:r>
+      <w:r>
+        <w:t xml:space="preserve"> </w:t>
+      </w:r>
+      <w:r>
+        <w:t xml:space="preserve">region, signal, motif, and sample-label conventions, so the output of one step</w:t>
+      </w:r>
+      <w:r>
+        <w:t xml:space="preserve"> </w:t>
+      </w:r>
+      <w:r>
+        <w:t xml:space="preserve">can be used directly by the next. YAML configuration files provide a</w:t>
+      </w:r>
+      <w:r>
+        <w:t xml:space="preserve"> </w:t>
+      </w:r>
+      <w:r>
+        <w:t xml:space="preserve">reproducible way to save and rerun the same analysis without changing the</w:t>
+      </w:r>
+      <w:r>
+        <w:t xml:space="preserve"> </w:t>
+      </w:r>
+      <w:r>
+        <w:t xml:space="preserve">underlying methods.</w:t>
       </w:r>
     </w:p>
     <w:p>
@@ -811,22 +854,13 @@
         <w:t xml:space="preserve"> </w:t>
       </w:r>
       <w:r>
-        <w:rPr>
-          <w:rStyle w:val="VerbatimChar"/>
-        </w:rPr>
-        <w:t xml:space="preserve">fp-tools</w:t>
-      </w:r>
-      <w:r>
-        <w:t xml:space="preserve"> </w:t>
-      </w:r>
-      <w:r>
-        <w:t xml:space="preserve">adds consistent command names, manifests, reusable</w:t>
-      </w:r>
-      <w:r>
-        <w:t xml:space="preserve"> </w:t>
-      </w:r>
-      <w:r>
-        <w:t xml:space="preserve">configuration, replicate summaries, and report generation around that signal.</w:t>
+        <w:t xml:space="preserve">The package keeps this signal definition while recording sample labels, input</w:t>
+      </w:r>
+      <w:r>
+        <w:t xml:space="preserve"> </w:t>
+      </w:r>
+      <w:r>
+        <w:t xml:space="preserve">manifests, reusable configuration, replicate summaries, and report outputs.</w:t>
       </w:r>
       <w:r>
         <w:t xml:space="preserve"> </w:t>
@@ -1205,8 +1239,8 @@
         <w:t xml:space="preserve">putative bound site and more cuts in nearby accessible flanks.</w:t>
       </w:r>
     </w:p>
-    <w:bookmarkEnd w:id="10"/>
-    <w:bookmarkStart w:id="11" w:name="de-novo-motif-discovery-preparation"/>
+    <w:bookmarkEnd w:id="11"/>
+    <w:bookmarkStart w:id="12" w:name="de-novo-motif-discovery-preparation"/>
     <w:p>
       <w:pPr>
         <w:pStyle w:val="Heading2"/>
@@ -1226,7 +1260,7 @@
         <w:t xml:space="preserve"> </w:t>
       </w:r>
       <w:r>
-        <w:t xml:space="preserve">which may be produced by footprint calling or supplied by the user. For each</w:t>
+        <w:t xml:space="preserve">which may be produced by footprint calling or provided as input. For each</w:t>
       </w:r>
       <w:r>
         <w:t xml:space="preserve"> </w:t>
@@ -1464,25 +1498,13 @@
         <w:t xml:space="preserve"> </w:t>
       </w:r>
       <w:r>
-        <w:t xml:space="preserve">The same entry point can be used in two modes. In de novo-only mode, discovered</w:t>
-      </w:r>
-      <w:r>
-        <w:t xml:space="preserve"> </w:t>
-      </w:r>
-      <w:r>
-        <w:t xml:space="preserve">motifs are reported as an independent motif set. In database-plus-de-novo mode,</w:t>
-      </w:r>
-      <w:r>
-        <w:t xml:space="preserve"> </w:t>
-      </w:r>
-      <w:r>
-        <w:t xml:space="preserve">discovered motifs are matched to a known database such as JASPAR</w:t>
-      </w:r>
-      <w:r>
-        <w:t xml:space="preserve"> </w:t>
-      </w:r>
-      <w:r>
-        <w:t xml:space="preserve">2026 </w:t>
+        <w:t xml:space="preserve">Discovered motifs can be analyzed as an independent motif set or matched to a</w:t>
+      </w:r>
+      <w:r>
+        <w:t xml:space="preserve"> </w:t>
+      </w:r>
+      <w:r>
+        <w:t xml:space="preserve">known database such as JASPAR 2026 </w:t>
       </w:r>
       <w:r>
         <w:t xml:space="preserve">(14)</w:t>
@@ -1491,34 +1513,13 @@
         <w:t xml:space="preserve"> </w:t>
       </w:r>
       <w:r>
-        <w:t xml:space="preserve">and can be appended to the known motif set for downstream</w:t>
-      </w:r>
-      <w:r>
-        <w:t xml:space="preserve"> </w:t>
-      </w:r>
-      <w:r>
-        <w:t xml:space="preserve">differential footprint analysis. Compared with the standard TOBIAS path, which</w:t>
-      </w:r>
-      <w:r>
-        <w:t xml:space="preserve"> </w:t>
-      </w:r>
-      <w:r>
-        <w:t xml:space="preserve">expects a supplied motif collection for scanning,</w:t>
-      </w:r>
-      <w:r>
-        <w:t xml:space="preserve"> </w:t>
-      </w:r>
-      <w:r>
-        <w:rPr>
-          <w:rStyle w:val="VerbatimChar"/>
-        </w:rPr>
-        <w:t xml:space="preserve">fp-tools</w:t>
-      </w:r>
-      <w:r>
-        <w:t xml:space="preserve"> </w:t>
-      </w:r>
-      <w:r>
-        <w:t xml:space="preserve">makes</w:t>
+        <w:t xml:space="preserve">and appended to the known</w:t>
+      </w:r>
+      <w:r>
+        <w:t xml:space="preserve"> </w:t>
+      </w:r>
+      <w:r>
+        <w:t xml:space="preserve">motif set for downstream differential footprint analysis. In this design,</w:t>
       </w:r>
       <w:r>
         <w:t xml:space="preserve"> </w:t>
@@ -1530,11 +1531,11 @@
         <w:t xml:space="preserve"> </w:t>
       </w:r>
       <w:r>
-        <w:t xml:space="preserve">augmentation part of the recorded analysis.</w:t>
-      </w:r>
-    </w:p>
-    <w:bookmarkEnd w:id="11"/>
-    <w:bookmarkStart w:id="12" w:name="pseudobulk-fragment-aggregation"/>
+        <w:t xml:space="preserve">augmentation become part of the recorded footprint analysis.</w:t>
+      </w:r>
+    </w:p>
+    <w:bookmarkEnd w:id="12"/>
+    <w:bookmarkStart w:id="13" w:name="pseudobulk-fragment-aggregation"/>
     <w:p>
       <w:pPr>
         <w:pStyle w:val="Heading2"/>
@@ -1795,7 +1796,7 @@
         <w:t xml:space="preserve"> </w:t>
       </w:r>
       <w:r>
-        <w:t xml:space="preserve">Groups that pass user-defined cell-count and fragment-count filters are written as</w:t>
+        <w:t xml:space="preserve">Groups that pass specified cell-count and fragment-count filters are written as</w:t>
       </w:r>
       <w:r>
         <w:t xml:space="preserve"> </w:t>
@@ -2015,37 +2016,25 @@
         <w:t xml:space="preserve"> </w:t>
       </w:r>
       <w:r>
-        <w:t xml:space="preserve">tracks can be used directly for motif-centered aggregate plots, matching the bulk</w:t>
-      </w:r>
-      <w:r>
-        <w:t xml:space="preserve"> </w:t>
-      </w:r>
-      <w:r>
-        <w:t xml:space="preserve">ATAC-seq analysis path. Users can therefore apply bulk-style footprinting to</w:t>
-      </w:r>
-      <w:r>
-        <w:t xml:space="preserve"> </w:t>
-      </w:r>
-      <w:r>
-        <w:t xml:space="preserve">grouped single-cell data without manually constructing every pseudobulk sample.</w:t>
-      </w:r>
-      <w:r>
-        <w:t xml:space="preserve"> </w:t>
-      </w:r>
-      <w:r>
-        <w:t xml:space="preserve">When requested, the full route writes pseudo-paired BAMs from grouped fragments</w:t>
-      </w:r>
-      <w:r>
-        <w:t xml:space="preserve"> </w:t>
-      </w:r>
-      <w:r>
-        <w:t xml:space="preserve">and then runs correction, scoring, motif-aware comparison, and plotting with the</w:t>
-      </w:r>
-      <w:r>
-        <w:t xml:space="preserve"> </w:t>
-      </w:r>
-      <w:r>
-        <w:t xml:space="preserve">same conventions used for bulk ATAC-seq.</w:t>
+        <w:t xml:space="preserve">tracks support motif-centered aggregate profiles matched to the bulk ATAC-seq</w:t>
+      </w:r>
+      <w:r>
+        <w:t xml:space="preserve"> </w:t>
+      </w:r>
+      <w:r>
+        <w:t xml:space="preserve">analysis path. The full pseudobulk route writes pseudo-paired BAMs from grouped</w:t>
+      </w:r>
+      <w:r>
+        <w:t xml:space="preserve"> </w:t>
+      </w:r>
+      <w:r>
+        <w:t xml:space="preserve">fragments and then runs correction, scoring, motif-aware comparison, and plotting</w:t>
+      </w:r>
+      <w:r>
+        <w:t xml:space="preserve"> </w:t>
+      </w:r>
+      <w:r>
+        <w:t xml:space="preserve">with the same conventions used for bulk ATAC-seq.</w:t>
       </w:r>
     </w:p>
     <w:p>
@@ -2136,23 +2125,23 @@
         <w:t xml:space="preserve"> </w:t>
       </w:r>
       <w:r>
-        <w:t xml:space="preserve">KNN-smoothed values are visualization scores; formal corrected footprint</w:t>
-      </w:r>
-      <w:r>
-        <w:t xml:space="preserve"> </w:t>
-      </w:r>
-      <w:r>
-        <w:t xml:space="preserve">inference remains based on grouped pseudobulk ATAC correction and footprint</w:t>
-      </w:r>
-      <w:r>
-        <w:t xml:space="preserve"> </w:t>
-      </w:r>
-      <w:r>
-        <w:t xml:space="preserve">scoring.</w:t>
-      </w:r>
-    </w:p>
-    <w:bookmarkEnd w:id="12"/>
-    <w:bookmarkStart w:id="13" w:name="sec:replicate"/>
+        <w:t xml:space="preserve">KNN-smoothed signatures summarize local, motif-centered cut-site patterns across</w:t>
+      </w:r>
+      <w:r>
+        <w:t xml:space="preserve"> </w:t>
+      </w:r>
+      <w:r>
+        <w:t xml:space="preserve">neighboring cells, while full ATAC-corrected footprint tracks are computed from</w:t>
+      </w:r>
+      <w:r>
+        <w:t xml:space="preserve"> </w:t>
+      </w:r>
+      <w:r>
+        <w:t xml:space="preserve">the grouped pseudobulk profiles.</w:t>
+      </w:r>
+    </w:p>
+    <w:bookmarkEnd w:id="13"/>
+    <w:bookmarkStart w:id="14" w:name="sec:replicate"/>
     <w:p>
       <w:pPr>
         <w:pStyle w:val="Heading2"/>
@@ -2184,7 +2173,7 @@
         <w:t xml:space="preserve"> </w:t>
       </w:r>
       <w:r>
-        <w:t xml:space="preserve">summaries, optional quantile normalization, and two complementary testing views.</w:t>
+        <w:t xml:space="preserve">summaries, and replicate-aware testing.</w:t>
       </w:r>
       <w:r>
         <w:t xml:space="preserve"> </w:t>
@@ -2302,7 +2291,7 @@
         <w:pStyle w:val="BodyText"/>
       </w:pPr>
       <w:r>
-        <w:t xml:space="preserve">The default distribution-comparison view is used directly by</w:t>
+        <w:t xml:space="preserve">For one-sample versus one-sample contrasts,</w:t>
       </w:r>
       <w:r>
         <w:t xml:space="preserve"> </w:t>
@@ -2314,156 +2303,34 @@
         <w:t xml:space="preserve">diff-footprints</w:t>
       </w:r>
       <w:r>
-        <w:t xml:space="preserve">. It supports either one sample per group or multiple</w:t>
-      </w:r>
-      <w:r>
-        <w:t xml:space="preserve"> </w:t>
-      </w:r>
-      <w:r>
-        <w:t xml:space="preserve">samples per group. When repeated condition names are supplied, replicate scores</w:t>
-      </w:r>
-      <w:r>
-        <w:t xml:space="preserve"> </w:t>
-      </w:r>
-      <w:r>
-        <w:t xml:space="preserve">are summarized into condition-level means and SDs before motif-level comparisons</w:t>
-      </w:r>
-      <w:r>
-        <w:t xml:space="preserve"> </w:t>
-      </w:r>
-      <w:r>
-        <w:t xml:space="preserve">are reported; when only one sample is present per group, the same motif and</w:t>
-      </w:r>
-      <w:r>
-        <w:t xml:space="preserve"> </w:t>
-      </w:r>
-      <w:r>
-        <w:t xml:space="preserve">background-distribution comparison is still available, but replicate-derived SD</w:t>
-      </w:r>
-      <w:r>
-        <w:t xml:space="preserve"> </w:t>
-      </w:r>
-      <w:r>
-        <w:t xml:space="preserve">and SE summaries are not interpreted as replicate uncertainty. A second</w:t>
-      </w:r>
-      <w:r>
-        <w:t xml:space="preserve"> </w:t>
-      </w:r>
-      <w:r>
-        <w:t xml:space="preserve">empirical-Bayes replicate-matrix view is available when per-replicate motif-score</w:t>
-      </w:r>
-      <w:r>
-        <w:t xml:space="preserve"> </w:t>
-      </w:r>
-      <w:r>
-        <w:t xml:space="preserve">matrices are built for a comparison. This view is limma-like rather than a direct</w:t>
-      </w:r>
-      <w:r>
-        <w:t xml:space="preserve"> </w:t>
-      </w:r>
-      <w:r>
-        <w:t xml:space="preserve">dependency on the R</w:t>
-      </w:r>
-      <w:r>
-        <w:t xml:space="preserve"> </w:t>
-      </w:r>
-      <w:r>
-        <w:rPr>
-          <w:rStyle w:val="VerbatimChar"/>
-        </w:rPr>
-        <w:t xml:space="preserve">limma</w:t>
-      </w:r>
-      <w:r>
-        <w:t xml:space="preserve"> </w:t>
-      </w:r>
-      <w:r>
-        <w:t xml:space="preserve">package: motif scores are transformed as</w:t>
-      </w:r>
-      <w:r>
-        <w:t xml:space="preserve"> </w:t>
-      </w:r>
-      <m:oMath>
-        <m:sSub>
-          <m:e>
-            <m:r>
-              <m:rPr>
-                <m:sty m:val="p"/>
-              </m:rPr>
-              <m:t>log</m:t>
-            </m:r>
-          </m:e>
-          <m:sub>
-            <m:r>
-              <m:t>2</m:t>
-            </m:r>
-          </m:sub>
-        </m:sSub>
-        <m:r>
-          <m:rPr>
-            <m:sty m:val="p"/>
-          </m:rPr>
-          <m:t>(</m:t>
-        </m:r>
-        <m:r>
-          <m:t>1000</m:t>
-        </m:r>
-        <m:r>
-          <m:t>x</m:t>
-        </m:r>
-        <m:r>
-          <m:rPr>
-            <m:sty m:val="p"/>
-          </m:rPr>
-          <m:t>+</m:t>
-        </m:r>
-        <m:r>
-          <m:t>1</m:t>
-        </m:r>
-        <m:r>
-          <m:rPr>
-            <m:sty m:val="p"/>
-          </m:rPr>
-          <m:t>)</m:t>
-        </m:r>
-      </m:oMath>
-      <w:r>
-        <w:t xml:space="preserve">, condition effects are estimated from replicate groups, and</w:t>
-      </w:r>
-      <w:r>
-        <w:t xml:space="preserve"> </w:t>
-      </w:r>
-      <w:r>
-        <w:t xml:space="preserve">the per-motif pooled variance is moderated toward the median variance across</w:t>
-      </w:r>
-      <w:r>
-        <w:t xml:space="preserve"> </w:t>
-      </w:r>
-      <w:r>
-        <w:t xml:space="preserve">motifs before computing a moderated t-statistic and Benjamini–Hochberg-adjusted</w:t>
-      </w:r>
-      <w:r>
-        <w:t xml:space="preserve"> </w:t>
-      </w:r>
-      <w:r>
-        <w:t xml:space="preserve">q-values. This empirical-Bayes view is used as a replicate-aware audit and</w:t>
-      </w:r>
-      <w:r>
-        <w:t xml:space="preserve"> </w:t>
-      </w:r>
-      <w:r>
-        <w:t xml:space="preserve">alternative reporting view for replicate-supported comparisons, while the native</w:t>
-      </w:r>
-      <w:r>
-        <w:t xml:space="preserve"> </w:t>
-      </w:r>
-      <w:r>
-        <w:t xml:space="preserve">distribution-comparison columns are preserved for traceability.</w:t>
-      </w:r>
-      <w:r>
-        <w:t xml:space="preserve"> </w:t>
-      </w:r>
-      <w:r>
-        <w:t xml:space="preserve">Relative to a conventional TOBIAS-style two-condition report,</w:t>
+        <w:t xml:space="preserve"> </w:t>
+      </w:r>
+      <w:r>
+        <w:t xml:space="preserve">uses a</w:t>
+      </w:r>
+      <w:r>
+        <w:t xml:space="preserve"> </w:t>
+      </w:r>
+      <w:r>
+        <w:t xml:space="preserve">motif-site versus background-distribution comparison. Candidate sites are grouped</w:t>
+      </w:r>
+      <w:r>
+        <w:t xml:space="preserve"> </w:t>
+      </w:r>
+      <w:r>
+        <w:t xml:space="preserve">by motif, motif-site changes are compared with matched background changes, and</w:t>
+      </w:r>
+      <w:r>
+        <w:t xml:space="preserve"> </w:t>
+      </w:r>
+      <w:r>
+        <w:t xml:space="preserve">p-values are adjusted across motifs within each contrast. When multiple samples</w:t>
+      </w:r>
+      <w:r>
+        <w:t xml:space="preserve"> </w:t>
+      </w:r>
+      <w:r>
+        <w:t xml:space="preserve">are available in a condition,</w:t>
       </w:r>
       <w:r>
         <w:t xml:space="preserve"> </w:t>
@@ -2478,13 +2345,55 @@
         <w:t xml:space="preserve"> </w:t>
       </w:r>
       <w:r>
-        <w:t xml:space="preserve">makes replicate labels, single-sample comparisons, replicate-supported summaries,</w:t>
-      </w:r>
-      <w:r>
-        <w:t xml:space="preserve"> </w:t>
-      </w:r>
-      <w:r>
-        <w:t xml:space="preserve">and display-priority flags explicit in the exported tables.</w:t>
+        <w:t xml:space="preserve">additionally aggregates motif</w:t>
+      </w:r>
+      <w:r>
+        <w:t xml:space="preserve"> </w:t>
+      </w:r>
+      <w:r>
+        <w:t xml:space="preserve">scores per sample and applies empirical-Bayes variance moderation across motifs,</w:t>
+      </w:r>
+      <w:r>
+        <w:t xml:space="preserve"> </w:t>
+      </w:r>
+      <w:r>
+        <w:t xml:space="preserve">following the moderated testing framework of Smyth </w:t>
+      </w:r>
+      <w:r>
+        <w:t xml:space="preserve">(16)</w:t>
+      </w:r>
+      <w:r>
+        <w:t xml:space="preserve">. The</w:t>
+      </w:r>
+      <w:r>
+        <w:t xml:space="preserve"> </w:t>
+      </w:r>
+      <w:r>
+        <w:t xml:space="preserve">replicate-supported table reports condition means, replicate counts, condition</w:t>
+      </w:r>
+      <w:r>
+        <w:t xml:space="preserve"> </w:t>
+      </w:r>
+      <w:r>
+        <w:t xml:space="preserve">SDs and SEs, moderated test statistics, and Benjamini–Hochberg-adjusted</w:t>
+      </w:r>
+      <w:r>
+        <w:t xml:space="preserve"> </w:t>
+      </w:r>
+      <w:r>
+        <w:t xml:space="preserve">q-values. This separates single-sample distributional comparisons from</w:t>
+      </w:r>
+      <w:r>
+        <w:t xml:space="preserve"> </w:t>
+      </w:r>
+      <w:r>
+        <w:t xml:space="preserve">replicate-supported inference while keeping both outputs in the same</w:t>
+      </w:r>
+      <w:r>
+        <w:t xml:space="preserve"> </w:t>
+      </w:r>
+      <w:r>
+        <w:t xml:space="preserve">differential-footprint report.</w:t>
       </w:r>
     </w:p>
     <w:p>
@@ -4631,8 +4540,8 @@
         <w:t xml:space="preserve">and standard-error summaries.</w:t>
       </w:r>
     </w:p>
-    <w:bookmarkEnd w:id="13"/>
-    <w:bookmarkStart w:id="14" w:name="sec:processing_provenance"/>
+    <w:bookmarkEnd w:id="14"/>
+    <w:bookmarkStart w:id="15" w:name="sec:processing_provenance"/>
     <w:p>
       <w:pPr>
         <w:pStyle w:val="Heading2"/>
@@ -4673,19 +4582,19 @@
         <w:t xml:space="preserve">Reads were trimmed with fastp </w:t>
       </w:r>
       <w:r>
-        <w:t xml:space="preserve">(16)</w:t>
+        <w:t xml:space="preserve">(17)</w:t>
       </w:r>
       <w:r>
         <w:t xml:space="preserve">, aligned with Bowtie2 </w:t>
       </w:r>
       <w:r>
-        <w:t xml:space="preserve">(17)</w:t>
+        <w:t xml:space="preserve">(18)</w:t>
       </w:r>
       <w:r>
         <w:t xml:space="preserve">, processed with SAMtools </w:t>
       </w:r>
       <w:r>
-        <w:t xml:space="preserve">(18)</w:t>
+        <w:t xml:space="preserve">(19)</w:t>
       </w:r>
       <w:r>
         <w:t xml:space="preserve"> </w:t>
@@ -4694,19 +4603,19 @@
         <w:t xml:space="preserve">and BEDTools </w:t>
       </w:r>
       <w:r>
-        <w:t xml:space="preserve">(19)</w:t>
+        <w:t xml:space="preserve">(20)</w:t>
       </w:r>
       <w:r>
         <w:t xml:space="preserve">, and peaks were called with MACS3 using the MACS model-based peak-calling framework </w:t>
       </w:r>
       <w:r>
-        <w:t xml:space="preserve">(20)</w:t>
+        <w:t xml:space="preserve">(21)</w:t>
       </w:r>
       <w:r>
         <w:t xml:space="preserve">. Problematic genomic regions were filtered using the ENCODE blacklist </w:t>
       </w:r>
       <w:r>
-        <w:t xml:space="preserve">(21)</w:t>
+        <w:t xml:space="preserve">(22)</w:t>
       </w:r>
       <w:r>
         <w:t xml:space="preserve">. Replicate peaks were merged into a common peak universe, bias-corrected, footprint-called,</w:t>
@@ -4794,8 +4703,8 @@
         <w:t xml:space="preserve">.</w:t>
       </w:r>
     </w:p>
-    <w:bookmarkEnd w:id="14"/>
-    <w:bookmarkStart w:id="15" w:name="public-data-evaluation-tiers-and-metrics"/>
+    <w:bookmarkEnd w:id="15"/>
+    <w:bookmarkStart w:id="16" w:name="public-data-evaluation-tiers-and-metrics"/>
     <w:p>
       <w:pPr>
         <w:pStyle w:val="Heading2"/>
@@ -4830,7 +4739,7 @@
         <w:t xml:space="preserve">download scripts query public repositories such as ENCODE </w:t>
       </w:r>
       <w:r>
-        <w:t xml:space="preserve">(22)</w:t>
+        <w:t xml:space="preserve">(23)</w:t>
       </w:r>
       <w:r>
         <w:t xml:space="preserve"> </w:t>
@@ -4877,7 +4786,7 @@
         <w:t xml:space="preserve">method assessment </w:t>
       </w:r>
       <w:r>
-        <w:t xml:space="preserve">(23,24)</w:t>
+        <w:t xml:space="preserve">(24,25)</w:t>
       </w:r>
       <w:r>
         <w:t xml:space="preserve">,</w:t>
@@ -5040,8 +4949,8 @@
         <w:br/>
       </w:r>
     </w:p>
-    <w:bookmarkEnd w:id="15"/>
-    <w:bookmarkStart w:id="16" w:name="reproducibility-engineering"/>
+    <w:bookmarkEnd w:id="16"/>
+    <w:bookmarkStart w:id="17" w:name="reproducibility-engineering"/>
     <w:p>
       <w:pPr>
         <w:pStyle w:val="Heading2"/>
@@ -5118,7 +5027,7 @@
         <w:t xml:space="preserve">bioinformatics environment practices </w:t>
       </w:r>
       <w:r>
-        <w:t xml:space="preserve">(25–27)</w:t>
+        <w:t xml:space="preserve">(26–28)</w:t>
       </w:r>
       <w:r>
         <w:t xml:space="preserve">.</w:t>
@@ -5160,9 +5069,9 @@
         <w:t xml:space="preserve">figure files are retained for auditability.</w:t>
       </w:r>
     </w:p>
-    <w:bookmarkEnd w:id="16"/>
     <w:bookmarkEnd w:id="17"/>
-    <w:bookmarkStart w:id="55" w:name="results"/>
+    <w:bookmarkEnd w:id="18"/>
+    <w:bookmarkStart w:id="56" w:name="results"/>
     <w:p>
       <w:pPr>
         <w:pStyle w:val="Heading1"/>
@@ -5206,7 +5115,7 @@
         <w:t xml:space="preserve">examples.</w:t>
       </w:r>
     </w:p>
-    <w:bookmarkStart w:id="23" w:name="X1d12b030c0e011596b18f05c9592026058c5dde"/>
+    <w:bookmarkStart w:id="24" w:name="X1d12b030c0e011596b18f05c9592026058c5dde"/>
     <w:p>
       <w:pPr>
         <w:pStyle w:val="Heading2"/>
@@ -5279,7 +5188,7 @@
         <w:t xml:space="preserve">).</w:t>
       </w:r>
     </w:p>
-    <w:bookmarkStart w:id="22" w:name="fig:workflow_overview"/>
+    <w:bookmarkStart w:id="23" w:name="fig:workflow_overview"/>
     <w:p>
       <w:pPr>
         <w:pStyle w:val="CaptionedFigure"/>
@@ -5289,18 +5198,18 @@
           <wp:inline>
             <wp:extent cx="4699000" cy="5143500"/>
             <wp:effectExtent b="0" l="0" r="0" t="0"/>
-            <wp:docPr descr="" title="" id="19" name="Picture"/>
+            <wp:docPr descr="" title="" id="20" name="Picture"/>
             <a:graphic>
               <a:graphicData uri="http://schemas.openxmlformats.org/drawingml/2006/picture">
                 <pic:pic>
                   <pic:nvPicPr>
-                    <pic:cNvPr descr="figures/Fig1.pdf" id="20" name="Picture"/>
+                    <pic:cNvPr descr="figures/Fig1.pdf" id="21" name="Picture"/>
                     <pic:cNvPicPr>
                       <a:picLocks noChangeArrowheads="1" noChangeAspect="1"/>
                     </pic:cNvPicPr>
                   </pic:nvPicPr>
                   <pic:blipFill>
-                    <a:blip r:embed="rId18"/>
+                    <a:blip r:embed="rId19"/>
                     <a:stretch>
                       <a:fillRect/>
                     </a:stretch>
@@ -5382,12 +5291,12 @@
       <w:r>
         <w:t xml:space="preserve"> </w:t>
       </w:r>
-      <w:bookmarkStart w:id="21" w:name="fig:workflow_overview"/>
-      <w:bookmarkEnd w:id="21"/>
-    </w:p>
-    <w:bookmarkEnd w:id="22"/>
+      <w:bookmarkStart w:id="22" w:name="fig:workflow_overview"/>
+      <w:bookmarkEnd w:id="22"/>
+    </w:p>
     <w:bookmarkEnd w:id="23"/>
-    <w:bookmarkStart w:id="24" w:name="interactive-interfaces-and-report-review"/>
+    <w:bookmarkEnd w:id="24"/>
+    <w:bookmarkStart w:id="25" w:name="interactive-interfaces-and-report-review"/>
     <w:p>
       <w:pPr>
         <w:pStyle w:val="Heading2"/>
@@ -5472,8 +5381,8 @@
         <w:t xml:space="preserve">aggregate profiles, and SVG export for publication-ready editing.</w:t>
       </w:r>
     </w:p>
-    <w:bookmarkEnd w:id="24"/>
-    <w:bookmarkStart w:id="25" w:name="regression-tested-outputs"/>
+    <w:bookmarkEnd w:id="25"/>
+    <w:bookmarkStart w:id="26" w:name="regression-tested-outputs"/>
     <w:p>
       <w:pPr>
         <w:pStyle w:val="Heading2"/>
@@ -5514,8 +5423,8 @@
         <w:t xml:space="preserve">modules to share the same input and output conventions.</w:t>
       </w:r>
     </w:p>
-    <w:bookmarkEnd w:id="25"/>
-    <w:bookmarkStart w:id="36" w:name="Xd39471bb8592f948e8a0bb2eb2de2159bacceab"/>
+    <w:bookmarkEnd w:id="26"/>
+    <w:bookmarkStart w:id="37" w:name="Xd39471bb8592f948e8a0bb2eb2de2159bacceab"/>
     <w:p>
       <w:pPr>
         <w:pStyle w:val="Heading2"/>
@@ -5594,7 +5503,7 @@
         <w:t xml:space="preserve">comparison </w:t>
       </w:r>
       <w:r>
-        <w:t xml:space="preserve">(22)</w:t>
+        <w:t xml:space="preserve">(23)</w:t>
       </w:r>
       <w:r>
         <w:t xml:space="preserve">.</w:t>
@@ -5671,13 +5580,13 @@
         <w:t xml:space="preserve"> </w:t>
       </w:r>
       <w:r>
-        <w:t xml:space="preserve">discovery can cover database-supported footprints, not as a replacement for a</w:t>
-      </w:r>
-      <w:r>
-        <w:t xml:space="preserve"> </w:t>
-      </w:r>
-      <w:r>
-        <w:t xml:space="preserve">curated motif database. In de novo-only mode, recovery was measured as base-pair</w:t>
+        <w:t xml:space="preserve">discovery can cover database-supported footprints and complement a curated motif</w:t>
+      </w:r>
+      <w:r>
+        <w:t xml:space="preserve"> </w:t>
+      </w:r>
+      <w:r>
+        <w:t xml:space="preserve">database. In de novo-only mode, recovery was measured as base-pair</w:t>
       </w:r>
       <w:r>
         <w:t xml:space="preserve"> </w:t>
@@ -5837,7 +5746,7 @@
         <w:t xml:space="preserve">).</w:t>
       </w:r>
     </w:p>
-    <w:bookmarkStart w:id="30" w:name="fig:denovo_validation"/>
+    <w:bookmarkStart w:id="31" w:name="fig:denovo_validation"/>
     <w:p>
       <w:pPr>
         <w:pStyle w:val="CaptionedFigure"/>
@@ -5847,18 +5756,18 @@
           <wp:inline>
             <wp:extent cx="5334000" cy="5519435"/>
             <wp:effectExtent b="0" l="0" r="0" t="0"/>
-            <wp:docPr descr="" title="" id="27" name="Picture"/>
+            <wp:docPr descr="" title="" id="28" name="Picture"/>
             <a:graphic>
               <a:graphicData uri="http://schemas.openxmlformats.org/drawingml/2006/picture">
                 <pic:pic>
                   <pic:nvPicPr>
-                    <pic:cNvPr descr="figures/Fig2.pdf" id="28" name="Picture"/>
+                    <pic:cNvPr descr="figures/Fig2.pdf" id="29" name="Picture"/>
                     <pic:cNvPicPr>
                       <a:picLocks noChangeArrowheads="1" noChangeAspect="1"/>
                     </pic:cNvPicPr>
                   </pic:nvPicPr>
                   <pic:blipFill>
-                    <a:blip r:embed="rId26"/>
+                    <a:blip r:embed="rId27"/>
                     <a:stretch>
                       <a:fillRect/>
                     </a:stretch>
@@ -5961,10 +5870,10 @@
       <w:r>
         <w:t xml:space="preserve"> </w:t>
       </w:r>
-      <w:bookmarkStart w:id="29" w:name="fig:denovo_validation"/>
-      <w:bookmarkEnd w:id="29"/>
-    </w:p>
-    <w:bookmarkEnd w:id="30"/>
+      <w:bookmarkStart w:id="30" w:name="fig:denovo_validation"/>
+      <w:bookmarkEnd w:id="30"/>
+    </w:p>
+    <w:bookmarkEnd w:id="31"/>
     <w:p>
       <w:pPr>
         <w:pStyle w:val="BodyText"/>
@@ -6002,7 +5911,7 @@
         <w:t xml:space="preserve">footprint profiles in one browser-review view.</w:t>
       </w:r>
     </w:p>
-    <w:bookmarkStart w:id="35" w:name="fig:differential_report"/>
+    <w:bookmarkStart w:id="36" w:name="fig:differential_report"/>
     <w:p>
       <w:pPr>
         <w:pStyle w:val="CaptionedFigure"/>
@@ -6012,18 +5921,18 @@
           <wp:inline>
             <wp:extent cx="5334000" cy="7352022"/>
             <wp:effectExtent b="0" l="0" r="0" t="0"/>
-            <wp:docPr descr="" title="" id="32" name="Picture"/>
+            <wp:docPr descr="" title="" id="33" name="Picture"/>
             <a:graphic>
               <a:graphicData uri="http://schemas.openxmlformats.org/drawingml/2006/picture">
                 <pic:pic>
                   <pic:nvPicPr>
-                    <pic:cNvPr descr="figures/Fig3_fullpage.png" id="33" name="Picture"/>
+                    <pic:cNvPr descr="figures/Fig3_fullpage.png" id="34" name="Picture"/>
                     <pic:cNvPicPr>
                       <a:picLocks noChangeArrowheads="1" noChangeAspect="1"/>
                     </pic:cNvPicPr>
                   </pic:nvPicPr>
                   <pic:blipFill>
-                    <a:blip r:embed="rId31"/>
+                    <a:blip r:embed="rId32"/>
                     <a:stretch>
                       <a:fillRect/>
                     </a:stretch>
@@ -6084,12 +5993,12 @@
       <w:r>
         <w:t xml:space="preserve"> </w:t>
       </w:r>
-      <w:bookmarkStart w:id="34" w:name="fig:differential_report"/>
-      <w:bookmarkEnd w:id="34"/>
-    </w:p>
-    <w:bookmarkEnd w:id="35"/>
+      <w:bookmarkStart w:id="35" w:name="fig:differential_report"/>
+      <w:bookmarkEnd w:id="35"/>
+    </w:p>
     <w:bookmarkEnd w:id="36"/>
-    <w:bookmarkStart w:id="37" w:name="X3d87f1cbe3b98d0199f75917ab8b41023e4a8ee"/>
+    <w:bookmarkEnd w:id="37"/>
+    <w:bookmarkStart w:id="38" w:name="X3d87f1cbe3b98d0199f75917ab8b41023e4a8ee"/>
     <w:p>
       <w:pPr>
         <w:pStyle w:val="Heading2"/>
@@ -6141,61 +6050,49 @@
         <w:pStyle w:val="BodyText"/>
       </w:pPr>
       <w:r>
-        <w:t xml:space="preserve">Repeated condition names define biological replicate groups. The output table</w:t>
-      </w:r>
-      <w:r>
-        <w:t xml:space="preserve"> </w:t>
-      </w:r>
-      <w:r>
-        <w:t xml:space="preserve">reports condition means alongside individual replicate profiles, and sample-level</w:t>
-      </w:r>
-      <w:r>
-        <w:t xml:space="preserve"> </w:t>
-      </w:r>
-      <w:r>
-        <w:t xml:space="preserve">quantile normalization applies distribution matching before replicate group</w:t>
-      </w:r>
-      <w:r>
-        <w:t xml:space="preserve"> </w:t>
-      </w:r>
-      <w:r>
-        <w:t xml:space="preserve">averages are compared. The native distribution-comparison view supports both</w:t>
-      </w:r>
-      <w:r>
-        <w:t xml:space="preserve"> </w:t>
-      </w:r>
-      <w:r>
-        <w:t xml:space="preserve">single-sample contrasts and multi-sample groups; replicate groups add condition</w:t>
-      </w:r>
-      <w:r>
-        <w:t xml:space="preserve"> </w:t>
-      </w:r>
-      <w:r>
-        <w:t xml:space="preserve">SD, SE, and replicate-count summaries around the same motif-background</w:t>
-      </w:r>
-      <w:r>
-        <w:t xml:space="preserve"> </w:t>
-      </w:r>
-      <w:r>
-        <w:t xml:space="preserve">comparison. For replicate-supported matrix analyses, the limma-like</w:t>
-      </w:r>
-      <w:r>
-        <w:t xml:space="preserve"> </w:t>
-      </w:r>
-      <w:r>
-        <w:t xml:space="preserve">empirical-Bayes view provides a second report in which per-motif replicate</w:t>
-      </w:r>
-      <w:r>
-        <w:t xml:space="preserve"> </w:t>
-      </w:r>
-      <w:r>
-        <w:t xml:space="preserve">variation is moderated across the motif set before p-values and q-values are</w:t>
-      </w:r>
-      <w:r>
-        <w:t xml:space="preserve"> </w:t>
-      </w:r>
-      <w:r>
-        <w:t xml:space="preserve">assigned.</w:t>
+        <w:t xml:space="preserve">Repeated condition names define biological replicate groups. In one-sample</w:t>
+      </w:r>
+      <w:r>
+        <w:t xml:space="preserve"> </w:t>
+      </w:r>
+      <w:r>
+        <w:t xml:space="preserve">contrasts, the report uses the motif-site versus background-distribution</w:t>
+      </w:r>
+      <w:r>
+        <w:t xml:space="preserve"> </w:t>
+      </w:r>
+      <w:r>
+        <w:t xml:space="preserve">comparison. When multiple samples are available, motif scores are first</w:t>
+      </w:r>
+      <w:r>
+        <w:t xml:space="preserve"> </w:t>
+      </w:r>
+      <w:r>
+        <w:t xml:space="preserve">aggregated per sample and then analyzed with empirical-Bayes variance moderation</w:t>
+      </w:r>
+      <w:r>
+        <w:t xml:space="preserve"> </w:t>
+      </w:r>
+      <w:r>
+        <w:t xml:space="preserve">across motifs </w:t>
+      </w:r>
+      <w:r>
+        <w:t xml:space="preserve">(16)</w:t>
+      </w:r>
+      <w:r>
+        <w:t xml:space="preserve">. The replicate-supported output reports condition</w:t>
+      </w:r>
+      <w:r>
+        <w:t xml:space="preserve"> </w:t>
+      </w:r>
+      <w:r>
+        <w:t xml:space="preserve">means, replicate counts, SD and SE summaries, moderated statistics, and adjusted</w:t>
+      </w:r>
+      <w:r>
+        <w:t xml:space="preserve"> </w:t>
+      </w:r>
+      <w:r>
+        <w:t xml:space="preserve">q-values alongside the original motif-background comparison.</w:t>
       </w:r>
     </w:p>
     <w:p>
@@ -6242,7 +6139,7 @@
         <w:t xml:space="preserve">T-cell differentiation </w:t>
       </w:r>
       <w:r>
-        <w:t xml:space="preserve">(28)</w:t>
+        <w:t xml:space="preserve">(29)</w:t>
       </w:r>
       <w:r>
         <w:t xml:space="preserve">, and ATF7 is included as a strong</w:t>
@@ -6266,7 +6163,7 @@
         <w:t xml:space="preserve">cells </w:t>
       </w:r>
       <w:r>
-        <w:t xml:space="preserve">(29)</w:t>
+        <w:t xml:space="preserve">(30)</w:t>
       </w:r>
       <w:r>
         <w:t xml:space="preserve">, although its aggregate depletion is modest here. We</w:t>
@@ -6290,8 +6187,8 @@
         <w:t xml:space="preserve">indicates stronger footprint-like protection at motif centers.</w:t>
       </w:r>
     </w:p>
-    <w:bookmarkEnd w:id="37"/>
-    <w:bookmarkStart w:id="43" w:name="Xd452c4080251f89b272aa3c0e0877a77f86ceff"/>
+    <w:bookmarkEnd w:id="38"/>
+    <w:bookmarkStart w:id="44" w:name="Xd452c4080251f89b272aa3c0e0877a77f86ceff"/>
     <w:p>
       <w:pPr>
         <w:pStyle w:val="Heading2"/>
@@ -6314,7 +6211,7 @@
         <w:t xml:space="preserve">granulocyte-depleted Multiome dataset </w:t>
       </w:r>
       <w:r>
-        <w:t xml:space="preserve">(30)</w:t>
+        <w:t xml:space="preserve">(31)</w:t>
       </w:r>
       <w:r>
         <w:t xml:space="preserve">. Using the official</w:t>
@@ -6442,7 +6339,13 @@
         <w:t xml:space="preserve"> </w:t>
       </w:r>
       <w:r>
-        <w:t xml:space="preserve">with preparing a pseudobulk input and then running TOBIAS separately,</w:t>
+        <w:t xml:space="preserve">with preparing pseudobulk inputs outside the footprinting analysis and then</w:t>
+      </w:r>
+      <w:r>
+        <w:t xml:space="preserve"> </w:t>
+      </w:r>
+      <w:r>
+        <w:t xml:space="preserve">running TOBIAS,</w:t>
       </w:r>
       <w:r>
         <w:t xml:space="preserve"> </w:t>
@@ -6457,13 +6360,19 @@
         <w:t xml:space="preserve"> </w:t>
       </w:r>
       <w:r>
-        <w:t xml:space="preserve">keeps barcode grouping, pseudobulk QC, correction, footprint</w:t>
-      </w:r>
-      <w:r>
-        <w:t xml:space="preserve"> </w:t>
-      </w:r>
-      <w:r>
-        <w:t xml:space="preserve">scoring, motif-aware comparison, and aggregate plotting in one recorded route.</w:t>
+        <w:t xml:space="preserve">records barcode grouping, pseudobulk QC,</w:t>
+      </w:r>
+      <w:r>
+        <w:t xml:space="preserve"> </w:t>
+      </w:r>
+      <w:r>
+        <w:t xml:space="preserve">correction, footprint scoring, motif-aware comparison, and aggregate plotting in</w:t>
+      </w:r>
+      <w:r>
+        <w:t xml:space="preserve"> </w:t>
+      </w:r>
+      <w:r>
+        <w:t xml:space="preserve">one analysis route.</w:t>
       </w:r>
       <w:r>
         <w:t xml:space="preserve"> </w:t>
@@ -6484,7 +6393,7 @@
         <w:t xml:space="preserve">baselines such as chromVAR </w:t>
       </w:r>
       <w:r>
-        <w:t xml:space="preserve">(31–33)</w:t>
+        <w:t xml:space="preserve">(32–34)</w:t>
       </w:r>
       <w:r>
         <w:t xml:space="preserve">.</w:t>
@@ -6542,7 +6451,7 @@
         <w:t xml:space="preserve">5k PBMC single-cell ATAC dataset </w:t>
       </w:r>
       <w:r>
-        <w:t xml:space="preserve">(34)</w:t>
+        <w:t xml:space="preserve">(35)</w:t>
       </w:r>
       <w:r>
         <w:t xml:space="preserve">. This example used</w:t>
@@ -6575,13 +6484,13 @@
         <w:t xml:space="preserve"> </w:t>
       </w:r>
       <w:r>
-        <w:t xml:space="preserve">plotted value is a KNN-smoothed footprint-signature score, not an independently</w:t>
-      </w:r>
-      <w:r>
-        <w:t xml:space="preserve"> </w:t>
-      </w:r>
-      <w:r>
-        <w:t xml:space="preserve">bias-corrected single-cell footprint call. We summarize these scores as a</w:t>
+        <w:t xml:space="preserve">plotted value is a KNN-smoothed footprint-signature score derived from local</w:t>
+      </w:r>
+      <w:r>
+        <w:t xml:space="preserve"> </w:t>
+      </w:r>
+      <w:r>
+        <w:t xml:space="preserve">motif-centered cut-site profiles. We summarize these scores as a</w:t>
       </w:r>
       <w:r>
         <w:t xml:space="preserve"> </w:t>
@@ -6631,7 +6540,7 @@
         <w:t xml:space="preserve">).</w:t>
       </w:r>
     </w:p>
-    <w:bookmarkStart w:id="42" w:name="fig:single_cell_footprinting"/>
+    <w:bookmarkStart w:id="43" w:name="fig:single_cell_footprinting"/>
     <w:p>
       <w:pPr>
         <w:pStyle w:val="CaptionedFigure"/>
@@ -6641,18 +6550,18 @@
           <wp:inline>
             <wp:extent cx="5334000" cy="6902823"/>
             <wp:effectExtent b="0" l="0" r="0" t="0"/>
-            <wp:docPr descr="" title="" id="39" name="Picture"/>
+            <wp:docPr descr="" title="" id="40" name="Picture"/>
             <a:graphic>
               <a:graphicData uri="http://schemas.openxmlformats.org/drawingml/2006/picture">
                 <pic:pic>
                   <pic:nvPicPr>
-                    <pic:cNvPr descr="figures/Fig4.pdf" id="40" name="Picture"/>
+                    <pic:cNvPr descr="figures/Fig4.pdf" id="41" name="Picture"/>
                     <pic:cNvPicPr>
                       <a:picLocks noChangeArrowheads="1" noChangeAspect="1"/>
                     </pic:cNvPicPr>
                   </pic:nvPicPr>
                   <pic:blipFill>
-                    <a:blip r:embed="rId38"/>
+                    <a:blip r:embed="rId39"/>
                     <a:stretch>
                       <a:fillRect/>
                     </a:stretch>
@@ -6740,17 +6649,17 @@
         <w:t xml:space="preserve"> </w:t>
       </w:r>
       <w:r>
-        <w:t xml:space="preserve">formal corrected footprint inference is performed at the pseudobulk level.</w:t>
-      </w:r>
-      <w:r>
-        <w:t xml:space="preserve"> </w:t>
-      </w:r>
-      <w:bookmarkStart w:id="41" w:name="fig:single_cell_footprinting"/>
-      <w:bookmarkEnd w:id="41"/>
-    </w:p>
-    <w:bookmarkEnd w:id="42"/>
+        <w:t xml:space="preserve">ATAC-corrected footprint tracks are computed from grouped pseudobulk profiles.</w:t>
+      </w:r>
+      <w:r>
+        <w:t xml:space="preserve"> </w:t>
+      </w:r>
+      <w:bookmarkStart w:id="42" w:name="fig:single_cell_footprinting"/>
+      <w:bookmarkEnd w:id="42"/>
+    </w:p>
     <w:bookmarkEnd w:id="43"/>
-    <w:bookmarkStart w:id="54" w:name="evaluation-and-figure-reproducibility"/>
+    <w:bookmarkEnd w:id="44"/>
+    <w:bookmarkStart w:id="55" w:name="evaluation-and-figure-reproducibility"/>
     <w:p>
       <w:pPr>
         <w:pStyle w:val="Heading2"/>
@@ -6860,7 +6769,7 @@
         <w:t xml:space="preserve"> </w:t>
       </w:r>
       <w:r>
-        <w:t xml:space="preserve">inspection accessible to users who do not routinely work at the command line</w:t>
+        <w:t xml:space="preserve">inspection accessible to researchers who do not routinely work at the command line</w:t>
       </w:r>
       <w:r>
         <w:t xml:space="preserve"> </w:t>
@@ -6880,7 +6789,7 @@
         <w:t xml:space="preserve">).</w:t>
       </w:r>
     </w:p>
-    <w:bookmarkStart w:id="48" w:name="fig:engineering"/>
+    <w:bookmarkStart w:id="49" w:name="fig:engineering"/>
     <w:p>
       <w:pPr>
         <w:pStyle w:val="CaptionedFigure"/>
@@ -6890,18 +6799,18 @@
           <wp:inline>
             <wp:extent cx="2667000" cy="807653"/>
             <wp:effectExtent b="0" l="0" r="0" t="0"/>
-            <wp:docPr descr="" title="" id="45" name="Picture"/>
+            <wp:docPr descr="" title="" id="46" name="Picture"/>
             <a:graphic>
               <a:graphicData uri="http://schemas.openxmlformats.org/drawingml/2006/picture">
                 <pic:pic>
                   <pic:nvPicPr>
-                    <pic:cNvPr descr="figures/Fig5.pdf" id="46" name="Picture"/>
+                    <pic:cNvPr descr="figures/Fig5.pdf" id="47" name="Picture"/>
                     <pic:cNvPicPr>
                       <a:picLocks noChangeArrowheads="1" noChangeAspect="1"/>
                     </pic:cNvPicPr>
                   </pic:nvPicPr>
                   <pic:blipFill>
-                    <a:blip r:embed="rId44"/>
+                    <a:blip r:embed="rId45"/>
                     <a:stretch>
                       <a:fillRect/>
                     </a:stretch>
@@ -6997,11 +6906,11 @@
       <w:r>
         <w:t xml:space="preserve"> </w:t>
       </w:r>
-      <w:bookmarkStart w:id="47" w:name="fig:engineering"/>
-      <w:bookmarkEnd w:id="47"/>
-    </w:p>
-    <w:bookmarkEnd w:id="48"/>
-    <w:bookmarkStart w:id="53" w:name="fig:gui_interface"/>
+      <w:bookmarkStart w:id="48" w:name="fig:engineering"/>
+      <w:bookmarkEnd w:id="48"/>
+    </w:p>
+    <w:bookmarkEnd w:id="49"/>
+    <w:bookmarkStart w:id="54" w:name="fig:gui_interface"/>
     <w:p>
       <w:pPr>
         <w:pStyle w:val="CaptionedFigure"/>
@@ -7011,18 +6920,18 @@
           <wp:inline>
             <wp:extent cx="5334000" cy="3227637"/>
             <wp:effectExtent b="0" l="0" r="0" t="0"/>
-            <wp:docPr descr="" title="" id="50" name="Picture"/>
+            <wp:docPr descr="" title="" id="51" name="Picture"/>
             <a:graphic>
               <a:graphicData uri="http://schemas.openxmlformats.org/drawingml/2006/picture">
                 <pic:pic>
                   <pic:nvPicPr>
-                    <pic:cNvPr descr="figures/Fig6.png" id="51" name="Picture"/>
+                    <pic:cNvPr descr="figures/Fig6.png" id="52" name="Picture"/>
                     <pic:cNvPicPr>
                       <a:picLocks noChangeArrowheads="1" noChangeAspect="1"/>
                     </pic:cNvPicPr>
                   </pic:nvPicPr>
                   <pic:blipFill>
-                    <a:blip r:embed="rId49"/>
+                    <a:blip r:embed="rId50"/>
                     <a:stretch>
                       <a:fillRect/>
                     </a:stretch>
@@ -7077,13 +6986,13 @@
       <w:r>
         <w:t xml:space="preserve"> </w:t>
       </w:r>
-      <w:bookmarkStart w:id="52" w:name="fig:gui_interface"/>
-      <w:bookmarkEnd w:id="52"/>
-    </w:p>
-    <w:bookmarkEnd w:id="53"/>
+      <w:bookmarkStart w:id="53" w:name="fig:gui_interface"/>
+      <w:bookmarkEnd w:id="53"/>
+    </w:p>
     <w:bookmarkEnd w:id="54"/>
     <w:bookmarkEnd w:id="55"/>
-    <w:bookmarkStart w:id="58" w:name="discussion"/>
+    <w:bookmarkEnd w:id="56"/>
+    <w:bookmarkStart w:id="59" w:name="discussion"/>
     <w:p>
       <w:pPr>
         <w:pStyle w:val="Heading1"/>
@@ -7200,46 +7109,40 @@
         <w:t xml:space="preserve"> </w:t>
       </w:r>
       <w:r>
-        <w:t xml:space="preserve">does not</w:t>
-      </w:r>
-      <w:r>
-        <w:t xml:space="preserve"> </w:t>
-      </w:r>
-      <w:r>
-        <w:t xml:space="preserve">claim a new Tn5 bias-correction model or a fundamentally different</w:t>
-      </w:r>
-      <w:r>
-        <w:t xml:space="preserve"> </w:t>
-      </w:r>
-      <w:r>
-        <w:t xml:space="preserve">center-versus-flank footprint statistic. The improvement is at the usability and</w:t>
-      </w:r>
-      <w:r>
-        <w:t xml:space="preserve"> </w:t>
-      </w:r>
-      <w:r>
-        <w:t xml:space="preserve">reproducibility layer: faster core operations, consistent modern command names,</w:t>
-      </w:r>
-      <w:r>
-        <w:t xml:space="preserve"> </w:t>
-      </w:r>
-      <w:r>
-        <w:t xml:space="preserve">reusable YAML execution, report and SVG export, explicit replicate-reporting</w:t>
-      </w:r>
-      <w:r>
-        <w:t xml:space="preserve"> </w:t>
-      </w:r>
-      <w:r>
-        <w:t xml:space="preserve">modes, de novo motif-preparation handoff, pseudobulk single-cell aggregation, GUI</w:t>
-      </w:r>
-      <w:r>
-        <w:t xml:space="preserve"> </w:t>
-      </w:r>
-      <w:r>
-        <w:t xml:space="preserve">access, and regression-tested example outputs.</w:t>
-      </w:r>
-    </w:p>
-    <w:bookmarkStart w:id="56" w:name="tab:features"/>
+        <w:t xml:space="preserve">keeps the</w:t>
+      </w:r>
+      <w:r>
+        <w:t xml:space="preserve"> </w:t>
+      </w:r>
+      <w:r>
+        <w:t xml:space="preserve">same interpretable bias-corrected center-versus-flank signal model and improves</w:t>
+      </w:r>
+      <w:r>
+        <w:t xml:space="preserve"> </w:t>
+      </w:r>
+      <w:r>
+        <w:t xml:space="preserve">the surrounding analysis layer: faster core operations, consistent modern command</w:t>
+      </w:r>
+      <w:r>
+        <w:t xml:space="preserve"> </w:t>
+      </w:r>
+      <w:r>
+        <w:t xml:space="preserve">names, reusable YAML execution, report and SVG export, explicit</w:t>
+      </w:r>
+      <w:r>
+        <w:t xml:space="preserve"> </w:t>
+      </w:r>
+      <w:r>
+        <w:t xml:space="preserve">replicate-reporting modes, de novo motif-preparation handoff, pseudobulk</w:t>
+      </w:r>
+      <w:r>
+        <w:t xml:space="preserve"> </w:t>
+      </w:r>
+      <w:r>
+        <w:t xml:space="preserve">single-cell aggregation, GUI access, and regression-tested example outputs.</w:t>
+      </w:r>
+    </w:p>
+    <w:bookmarkStart w:id="57" w:name="tab:features"/>
     <w:p>
       <w:pPr>
         <w:pStyle w:val="TableCaption"/>
@@ -7251,7 +7154,7 @@
         <w:t xml:space="preserve"> </w:t>
       </w:r>
       <w:r>
-        <w:t xml:space="preserve">✓, documented native support;</w:t>
+        <w:t xml:space="preserve">Yes, documented native support;</w:t>
       </w:r>
       <w:r>
         <w:t xml:space="preserve"> </w:t>
@@ -7310,7 +7213,7 @@
         <w:t xml:space="preserve"> </w:t>
       </w:r>
       <w:r>
-        <w:t xml:space="preserve">motif-centered model rather than a claim of superior footprint biology.</w:t>
+        <w:t xml:space="preserve">motif-centered model.</w:t>
       </w:r>
       <w:r>
         <w:t xml:space="preserve"> </w:t>
@@ -7321,7 +7224,7 @@
         <w:tblStyle w:val="Table"/>
         <w:tblW w:type="auto" w:w="0"/>
         <w:tblLook w:firstRow="0" w:lastRow="0" w:firstColumn="0" w:lastColumn="0" w:noHBand="0" w:noVBand="0" w:val="0000"/>
-        <w:tblCaption w:val="Qualitative scope comparison across widely used ATAC-seq regulatory-analysis tools. ✓, documented native support; \circ, partial, indirect, or adjacent support; NA, outside the tool’s primary scope. The table summarizes analysis scope from public documentation and primary publications; it is not a performance benchmark and should be read with the different goals of each tool in mind. TOBIAS is the closest core footprinting comparator; the fp-tools columns emphasize added analysis and usability components around that motif-centered model rather than a claim of superior footprint biology. "/>
+        <w:tblCaption w:val="Qualitative scope comparison across widely used ATAC-seq regulatory-analysis tools. Yes, documented native support; \circ, partial, indirect, or adjacent support; NA, outside the tool’s primary scope. The table summarizes analysis scope from public documentation and primary publications; it is not a performance benchmark and should be read with the different goals of each tool in mind. TOBIAS is the closest core footprinting comparator; the fp-tools columns emphasize added analysis and usability components around that motif-centered model. "/>
       </w:tblPr>
       <w:tblGrid>
         <w:gridCol w:w="1131"/>
@@ -7683,43 +7586,43 @@
               <w:jc w:val="left"/>
             </w:pPr>
             <w:r>
-              <w:t xml:space="preserve">✓</w:t>
-            </w:r>
-          </w:p>
-        </w:tc>
-        <w:tc>
-          <w:tcPr/>
-          <w:p>
-            <w:pPr>
-              <w:pStyle w:val="Compact"/>
-              <w:jc w:val="left"/>
-            </w:pPr>
-            <w:r>
-              <w:t xml:space="preserve">✓</w:t>
-            </w:r>
-          </w:p>
-        </w:tc>
-        <w:tc>
-          <w:tcPr/>
-          <w:p>
-            <w:pPr>
-              <w:pStyle w:val="Compact"/>
-              <w:jc w:val="left"/>
-            </w:pPr>
-            <w:r>
-              <w:t xml:space="preserve">✓</w:t>
-            </w:r>
-          </w:p>
-        </w:tc>
-        <w:tc>
-          <w:tcPr/>
-          <w:p>
-            <w:pPr>
-              <w:pStyle w:val="Compact"/>
-              <w:jc w:val="left"/>
-            </w:pPr>
-            <w:r>
-              <w:t xml:space="preserve">✓</w:t>
+              <w:t xml:space="preserve">Yes</w:t>
+            </w:r>
+          </w:p>
+        </w:tc>
+        <w:tc>
+          <w:tcPr/>
+          <w:p>
+            <w:pPr>
+              <w:pStyle w:val="Compact"/>
+              <w:jc w:val="left"/>
+            </w:pPr>
+            <w:r>
+              <w:t xml:space="preserve">Yes</w:t>
+            </w:r>
+          </w:p>
+        </w:tc>
+        <w:tc>
+          <w:tcPr/>
+          <w:p>
+            <w:pPr>
+              <w:pStyle w:val="Compact"/>
+              <w:jc w:val="left"/>
+            </w:pPr>
+            <w:r>
+              <w:t xml:space="preserve">Yes</w:t>
+            </w:r>
+          </w:p>
+        </w:tc>
+        <w:tc>
+          <w:tcPr/>
+          <w:p>
+            <w:pPr>
+              <w:pStyle w:val="Compact"/>
+              <w:jc w:val="left"/>
+            </w:pPr>
+            <w:r>
+              <w:t xml:space="preserve">Yes</w:t>
             </w:r>
           </w:p>
         </w:tc>
@@ -7774,55 +7677,55 @@
               <w:jc w:val="left"/>
             </w:pPr>
             <w:r>
-              <w:t xml:space="preserve">✓</w:t>
-            </w:r>
-          </w:p>
-        </w:tc>
-        <w:tc>
-          <w:tcPr/>
-          <w:p>
-            <w:pPr>
-              <w:pStyle w:val="Compact"/>
-              <w:jc w:val="left"/>
-            </w:pPr>
-            <w:r>
-              <w:t xml:space="preserve">✓</w:t>
-            </w:r>
-          </w:p>
-        </w:tc>
-        <w:tc>
-          <w:tcPr/>
-          <w:p>
-            <w:pPr>
-              <w:pStyle w:val="Compact"/>
-              <w:jc w:val="left"/>
-            </w:pPr>
-            <w:r>
-              <w:t xml:space="preserve">✓</w:t>
-            </w:r>
-          </w:p>
-        </w:tc>
-        <w:tc>
-          <w:tcPr/>
-          <w:p>
-            <w:pPr>
-              <w:pStyle w:val="Compact"/>
-              <w:jc w:val="left"/>
-            </w:pPr>
-            <w:r>
-              <w:t xml:space="preserve">✓</w:t>
-            </w:r>
-          </w:p>
-        </w:tc>
-        <w:tc>
-          <w:tcPr/>
-          <w:p>
-            <w:pPr>
-              <w:pStyle w:val="Compact"/>
-              <w:jc w:val="left"/>
-            </w:pPr>
-            <w:r>
-              <w:t xml:space="preserve">✓</w:t>
+              <w:t xml:space="preserve">Yes</w:t>
+            </w:r>
+          </w:p>
+        </w:tc>
+        <w:tc>
+          <w:tcPr/>
+          <w:p>
+            <w:pPr>
+              <w:pStyle w:val="Compact"/>
+              <w:jc w:val="left"/>
+            </w:pPr>
+            <w:r>
+              <w:t xml:space="preserve">Yes</w:t>
+            </w:r>
+          </w:p>
+        </w:tc>
+        <w:tc>
+          <w:tcPr/>
+          <w:p>
+            <w:pPr>
+              <w:pStyle w:val="Compact"/>
+              <w:jc w:val="left"/>
+            </w:pPr>
+            <w:r>
+              <w:t xml:space="preserve">Yes</w:t>
+            </w:r>
+          </w:p>
+        </w:tc>
+        <w:tc>
+          <w:tcPr/>
+          <w:p>
+            <w:pPr>
+              <w:pStyle w:val="Compact"/>
+              <w:jc w:val="left"/>
+            </w:pPr>
+            <w:r>
+              <w:t xml:space="preserve">Yes</w:t>
+            </w:r>
+          </w:p>
+        </w:tc>
+        <w:tc>
+          <w:tcPr/>
+          <w:p>
+            <w:pPr>
+              <w:pStyle w:val="Compact"/>
+              <w:jc w:val="left"/>
+            </w:pPr>
+            <w:r>
+              <w:t xml:space="preserve">Yes</w:t>
             </w:r>
           </w:p>
         </w:tc>
@@ -7860,43 +7763,43 @@
               <w:jc w:val="left"/>
             </w:pPr>
             <w:r>
-              <w:t xml:space="preserve">✓</w:t>
-            </w:r>
-          </w:p>
-        </w:tc>
-        <w:tc>
-          <w:tcPr/>
-          <w:p>
-            <w:pPr>
-              <w:pStyle w:val="Compact"/>
-              <w:jc w:val="left"/>
-            </w:pPr>
-            <w:r>
-              <w:t xml:space="preserve">✓</w:t>
-            </w:r>
-          </w:p>
-        </w:tc>
-        <w:tc>
-          <w:tcPr/>
-          <w:p>
-            <w:pPr>
-              <w:pStyle w:val="Compact"/>
-              <w:jc w:val="left"/>
-            </w:pPr>
-            <w:r>
-              <w:t xml:space="preserve">✓</w:t>
-            </w:r>
-          </w:p>
-        </w:tc>
-        <w:tc>
-          <w:tcPr/>
-          <w:p>
-            <w:pPr>
-              <w:pStyle w:val="Compact"/>
-              <w:jc w:val="left"/>
-            </w:pPr>
-            <w:r>
-              <w:t xml:space="preserve">✓</w:t>
+              <w:t xml:space="preserve">Yes</w:t>
+            </w:r>
+          </w:p>
+        </w:tc>
+        <w:tc>
+          <w:tcPr/>
+          <w:p>
+            <w:pPr>
+              <w:pStyle w:val="Compact"/>
+              <w:jc w:val="left"/>
+            </w:pPr>
+            <w:r>
+              <w:t xml:space="preserve">Yes</w:t>
+            </w:r>
+          </w:p>
+        </w:tc>
+        <w:tc>
+          <w:tcPr/>
+          <w:p>
+            <w:pPr>
+              <w:pStyle w:val="Compact"/>
+              <w:jc w:val="left"/>
+            </w:pPr>
+            <w:r>
+              <w:t xml:space="preserve">Yes</w:t>
+            </w:r>
+          </w:p>
+        </w:tc>
+        <w:tc>
+          <w:tcPr/>
+          <w:p>
+            <w:pPr>
+              <w:pStyle w:val="Compact"/>
+              <w:jc w:val="left"/>
+            </w:pPr>
+            <w:r>
+              <w:t xml:space="preserve">Yes</w:t>
             </w:r>
           </w:p>
         </w:tc>
@@ -7946,19 +7849,19 @@
               <w:jc w:val="left"/>
             </w:pPr>
             <w:r>
-              <w:t xml:space="preserve">✓</w:t>
-            </w:r>
-          </w:p>
-        </w:tc>
-        <w:tc>
-          <w:tcPr/>
-          <w:p>
-            <w:pPr>
-              <w:pStyle w:val="Compact"/>
-              <w:jc w:val="left"/>
-            </w:pPr>
-            <w:r>
-              <w:t xml:space="preserve">✓</w:t>
+              <w:t xml:space="preserve">Yes</w:t>
+            </w:r>
+          </w:p>
+        </w:tc>
+        <w:tc>
+          <w:tcPr/>
+          <w:p>
+            <w:pPr>
+              <w:pStyle w:val="Compact"/>
+              <w:jc w:val="left"/>
+            </w:pPr>
+            <w:r>
+              <w:t xml:space="preserve">Yes</w:t>
             </w:r>
           </w:p>
         </w:tc>
@@ -8042,7 +7945,7 @@
               <w:jc w:val="left"/>
             </w:pPr>
             <w:r>
-              <w:t xml:space="preserve">✓</w:t>
+              <w:t xml:space="preserve">Yes</w:t>
             </w:r>
           </w:p>
         </w:tc>
@@ -8078,7 +7981,7 @@
               <w:jc w:val="left"/>
             </w:pPr>
             <w:r>
-              <w:t xml:space="preserve">✓</w:t>
+              <w:t xml:space="preserve">Yes</w:t>
             </w:r>
           </w:p>
         </w:tc>
@@ -8133,7 +8036,7 @@
               <w:jc w:val="left"/>
             </w:pPr>
             <w:r>
-              <w:t xml:space="preserve">✓</w:t>
+              <w:t xml:space="preserve">Yes</w:t>
             </w:r>
           </w:p>
         </w:tc>
@@ -8179,7 +8082,7 @@
               <w:jc w:val="left"/>
             </w:pPr>
             <w:r>
-              <w:t xml:space="preserve">✓</w:t>
+              <w:t xml:space="preserve">Yes</w:t>
             </w:r>
           </w:p>
         </w:tc>
@@ -8239,7 +8142,7 @@
               <w:jc w:val="left"/>
             </w:pPr>
             <w:r>
-              <w:t xml:space="preserve">✓</w:t>
+              <w:t xml:space="preserve">Yes</w:t>
             </w:r>
           </w:p>
         </w:tc>
@@ -8340,19 +8243,19 @@
               <w:jc w:val="left"/>
             </w:pPr>
             <w:r>
-              <w:t xml:space="preserve">✓</w:t>
-            </w:r>
-          </w:p>
-        </w:tc>
-        <w:tc>
-          <w:tcPr/>
-          <w:p>
-            <w:pPr>
-              <w:pStyle w:val="Compact"/>
-              <w:jc w:val="left"/>
-            </w:pPr>
-            <w:r>
-              <w:t xml:space="preserve">✓</w:t>
+              <w:t xml:space="preserve">Yes</w:t>
+            </w:r>
+          </w:p>
+        </w:tc>
+        <w:tc>
+          <w:tcPr/>
+          <w:p>
+            <w:pPr>
+              <w:pStyle w:val="Compact"/>
+              <w:jc w:val="left"/>
+            </w:pPr>
+            <w:r>
+              <w:t xml:space="preserve">Yes</w:t>
             </w:r>
           </w:p>
         </w:tc>
@@ -8381,19 +8284,19 @@
               <w:jc w:val="left"/>
             </w:pPr>
             <w:r>
-              <w:t xml:space="preserve">✓</w:t>
-            </w:r>
-          </w:p>
-        </w:tc>
-        <w:tc>
-          <w:tcPr/>
-          <w:p>
-            <w:pPr>
-              <w:pStyle w:val="Compact"/>
-              <w:jc w:val="left"/>
-            </w:pPr>
-            <w:r>
-              <w:t xml:space="preserve">✓</w:t>
+              <w:t xml:space="preserve">Yes</w:t>
+            </w:r>
+          </w:p>
+        </w:tc>
+        <w:tc>
+          <w:tcPr/>
+          <w:p>
+            <w:pPr>
+              <w:pStyle w:val="Compact"/>
+              <w:jc w:val="left"/>
+            </w:pPr>
+            <w:r>
+              <w:t xml:space="preserve">Yes</w:t>
             </w:r>
           </w:p>
         </w:tc>
@@ -8436,7 +8339,7 @@
               <w:jc w:val="left"/>
             </w:pPr>
             <w:r>
-              <w:t xml:space="preserve">✓</w:t>
+              <w:t xml:space="preserve">Yes</w:t>
             </w:r>
           </w:p>
         </w:tc>
@@ -8502,7 +8405,7 @@
         </w:tc>
       </w:tr>
     </w:tbl>
-    <w:bookmarkEnd w:id="56"/>
+    <w:bookmarkEnd w:id="57"/>
     <w:p>
       <w:pPr>
         <w:pStyle w:val="BodyText"/>
@@ -8535,7 +8438,7 @@
         <w:t xml:space="preserve">frameworks such as diffTF </w:t>
       </w:r>
       <w:r>
-        <w:t xml:space="preserve">(35)</w:t>
+        <w:t xml:space="preserve">(36)</w:t>
       </w:r>
       <w:r>
         <w:t xml:space="preserve">. In this broader landscape,</w:t>
@@ -8553,52 +8456,40 @@
         <w:t xml:space="preserve"> </w:t>
       </w:r>
       <w:r>
-        <w:t xml:space="preserve">is best viewed as a practical extension of motif-centered ATAC</w:t>
-      </w:r>
-      <w:r>
-        <w:t xml:space="preserve"> </w:t>
-      </w:r>
-      <w:r>
-        <w:t xml:space="preserve">footprinting rather than a replacement for specialized single-cell,</w:t>
-      </w:r>
-      <w:r>
-        <w:t xml:space="preserve"> </w:t>
-      </w:r>
-      <w:r>
-        <w:t xml:space="preserve">deep-learning, or occupancy-prediction methods. Its replicate-aware summaries use</w:t>
-      </w:r>
-      <w:r>
-        <w:t xml:space="preserve"> </w:t>
-      </w:r>
-      <w:r>
-        <w:t xml:space="preserve">condition-level and replicate-level score variation to aid interpretation of</w:t>
-      </w:r>
-      <w:r>
-        <w:t xml:space="preserve"> </w:t>
-      </w:r>
-      <w:r>
-        <w:t xml:space="preserve">differential footprint comparisons. The default distribution-comparison report is</w:t>
-      </w:r>
-      <w:r>
-        <w:t xml:space="preserve"> </w:t>
-      </w:r>
-      <w:r>
-        <w:t xml:space="preserve">available for single-sample or multi-sample condition groups, and the</w:t>
-      </w:r>
-      <w:r>
-        <w:t xml:space="preserve"> </w:t>
-      </w:r>
-      <w:r>
-        <w:t xml:space="preserve">empirical-Bayes matrix view provides a limma-like moderated replicate analysis</w:t>
-      </w:r>
-      <w:r>
-        <w:t xml:space="preserve"> </w:t>
-      </w:r>
-      <w:r>
-        <w:t xml:space="preserve">when a per-replicate motif-score matrix is available.</w:t>
-      </w:r>
-    </w:p>
-    <w:bookmarkStart w:id="57" w:name="threats-to-validity-and-scope"/>
+        <w:t xml:space="preserve">extends motif-centered ATAC footprinting by connecting corrected</w:t>
+      </w:r>
+      <w:r>
+        <w:t xml:space="preserve"> </w:t>
+      </w:r>
+      <w:r>
+        <w:t xml:space="preserve">cut-site profiles, motif interpretation, replicate-aware summaries, and</w:t>
+      </w:r>
+      <w:r>
+        <w:t xml:space="preserve"> </w:t>
+      </w:r>
+      <w:r>
+        <w:t xml:space="preserve">publication-ready reports. One-sample contrasts use the background-distribution</w:t>
+      </w:r>
+      <w:r>
+        <w:t xml:space="preserve"> </w:t>
+      </w:r>
+      <w:r>
+        <w:t xml:space="preserve">comparison, whereas replicate-supported contrasts use per-sample motif scores</w:t>
+      </w:r>
+      <w:r>
+        <w:t xml:space="preserve"> </w:t>
+      </w:r>
+      <w:r>
+        <w:t xml:space="preserve">with empirical-Bayes variance moderation to estimate differential footprint</w:t>
+      </w:r>
+      <w:r>
+        <w:t xml:space="preserve"> </w:t>
+      </w:r>
+      <w:r>
+        <w:t xml:space="preserve">statistics.</w:t>
+      </w:r>
+    </w:p>
+    <w:bookmarkStart w:id="58" w:name="threats-to-validity-and-scope"/>
     <w:p>
       <w:pPr>
         <w:pStyle w:val="Heading2"/>
@@ -8739,19 +8630,13 @@
         <w:t xml:space="preserve"> </w:t>
       </w:r>
       <w:r>
-        <w:t xml:space="preserve">footprint-signature scores are visualization summaries over neighboring cells,</w:t>
-      </w:r>
-      <w:r>
-        <w:t xml:space="preserve"> </w:t>
-      </w:r>
-      <w:r>
-        <w:t xml:space="preserve">whereas formal bias-corrected footprint inference is performed on grouped</w:t>
-      </w:r>
-      <w:r>
-        <w:t xml:space="preserve"> </w:t>
-      </w:r>
-      <w:r>
-        <w:t xml:space="preserve">pseudobulk data.</w:t>
+        <w:t xml:space="preserve">footprint-signature scores summarize neighboring-cell cut-site patterns, whereas</w:t>
+      </w:r>
+      <w:r>
+        <w:t xml:space="preserve"> </w:t>
+      </w:r>
+      <w:r>
+        <w:t xml:space="preserve">full bias-corrected footprint tracks are estimated from grouped pseudobulk data.</w:t>
       </w:r>
     </w:p>
     <w:p>
@@ -8792,9 +8677,9 @@
         <w:t xml:space="preserve">replicate counts.</w:t>
       </w:r>
     </w:p>
-    <w:bookmarkEnd w:id="57"/>
     <w:bookmarkEnd w:id="58"/>
-    <w:bookmarkStart w:id="59" w:name="conclusions"/>
+    <w:bookmarkEnd w:id="59"/>
+    <w:bookmarkStart w:id="60" w:name="conclusions"/>
     <w:p>
       <w:pPr>
         <w:pStyle w:val="Heading1"/>
@@ -8865,8 +8750,8 @@
         <w:t xml:space="preserve">differential-binding models.</w:t>
       </w:r>
     </w:p>
-    <w:bookmarkEnd w:id="59"/>
-    <w:bookmarkStart w:id="60" w:name="author-contributions"/>
+    <w:bookmarkEnd w:id="60"/>
+    <w:bookmarkStart w:id="61" w:name="author-contributions"/>
     <w:p>
       <w:pPr>
         <w:pStyle w:val="Heading1"/>
@@ -8913,8 +8798,8 @@
         <w:t xml:space="preserve">of the manuscript.</w:t>
       </w:r>
     </w:p>
-    <w:bookmarkEnd w:id="60"/>
-    <w:bookmarkStart w:id="61" w:name="funding"/>
+    <w:bookmarkEnd w:id="61"/>
+    <w:bookmarkStart w:id="62" w:name="funding"/>
     <w:p>
       <w:pPr>
         <w:pStyle w:val="Heading1"/>
@@ -8931,8 +8816,8 @@
         <w:t xml:space="preserve">This research received no external funding.</w:t>
       </w:r>
     </w:p>
-    <w:bookmarkEnd w:id="61"/>
-    <w:bookmarkStart w:id="62" w:name="institutional-review-board-statement"/>
+    <w:bookmarkEnd w:id="62"/>
+    <w:bookmarkStart w:id="63" w:name="institutional-review-board-statement"/>
     <w:p>
       <w:pPr>
         <w:pStyle w:val="Heading1"/>
@@ -8955,8 +8840,8 @@
         <w:t xml:space="preserve">de-identified datasets and did not involve new experiments on humans or animals.</w:t>
       </w:r>
     </w:p>
-    <w:bookmarkEnd w:id="62"/>
-    <w:bookmarkStart w:id="63" w:name="informed-consent-statement"/>
+    <w:bookmarkEnd w:id="63"/>
+    <w:bookmarkStart w:id="64" w:name="informed-consent-statement"/>
     <w:p>
       <w:pPr>
         <w:pStyle w:val="Heading1"/>
@@ -8973,8 +8858,8 @@
         <w:t xml:space="preserve">Not applicable.</w:t>
       </w:r>
     </w:p>
-    <w:bookmarkEnd w:id="63"/>
-    <w:bookmarkStart w:id="65" w:name="data-availability-statement"/>
+    <w:bookmarkEnd w:id="64"/>
+    <w:bookmarkStart w:id="66" w:name="data-availability-statement"/>
     <w:p>
       <w:pPr>
         <w:pStyle w:val="Heading1"/>
@@ -9008,7 +8893,7 @@
       <w:r>
         <w:t xml:space="preserve"> </w:t>
       </w:r>
-      <w:hyperlink r:id="rId64">
+      <w:hyperlink r:id="rId65">
         <w:r>
           <w:rPr>
             <w:rStyle w:val="VerbatimChar"/>
@@ -9062,7 +8947,7 @@
         <w:t xml:space="preserve">from the ENCODE Project </w:t>
       </w:r>
       <w:r>
-        <w:t xml:space="preserve">(22)</w:t>
+        <w:t xml:space="preserve">(23)</w:t>
       </w:r>
       <w:r>
         <w:t xml:space="preserve">, the 10x Genomics PBMC Multiome</w:t>
@@ -9074,7 +8959,7 @@
         <w:t xml:space="preserve">example </w:t>
       </w:r>
       <w:r>
-        <w:t xml:space="preserve">(30)</w:t>
+        <w:t xml:space="preserve">(31)</w:t>
       </w:r>
       <w:r>
         <w:t xml:space="preserve">, the 10x Genomics PBMC5k single-cell ATAC</w:t>
@@ -9086,7 +8971,7 @@
         <w:t xml:space="preserve">example </w:t>
       </w:r>
       <w:r>
-        <w:t xml:space="preserve">(34)</w:t>
+        <w:t xml:space="preserve">(35)</w:t>
       </w:r>
       <w:r>
         <w:t xml:space="preserve">, and motif databases such as</w:t>
@@ -9146,8 +9031,8 @@
         <w:t xml:space="preserve">regenerated from committed manifests.</w:t>
       </w:r>
     </w:p>
-    <w:bookmarkEnd w:id="65"/>
-    <w:bookmarkStart w:id="66" w:name="acknowledgments"/>
+    <w:bookmarkEnd w:id="66"/>
+    <w:bookmarkStart w:id="67" w:name="acknowledgments"/>
     <w:p>
       <w:pPr>
         <w:pStyle w:val="Heading1"/>
@@ -9176,8 +9061,8 @@
         <w:t xml:space="preserve">and software publicly available.</w:t>
       </w:r>
     </w:p>
-    <w:bookmarkEnd w:id="66"/>
-    <w:bookmarkStart w:id="67" w:name="conflicts-of-interest"/>
+    <w:bookmarkEnd w:id="67"/>
+    <w:bookmarkStart w:id="68" w:name="conflicts-of-interest"/>
     <w:p>
       <w:pPr>
         <w:pStyle w:val="Heading1"/>
@@ -9194,8 +9079,8 @@
         <w:t xml:space="preserve">The authors declare no conflicts of interest.</w:t>
       </w:r>
     </w:p>
-    <w:bookmarkEnd w:id="67"/>
-    <w:bookmarkStart w:id="141" w:name="appendix"/>
+    <w:bookmarkEnd w:id="68"/>
+    <w:bookmarkStart w:id="69" w:name="appendix"/>
     <w:p>
       <w:pPr>
         <w:pStyle w:val="Heading1"/>
@@ -9204,7 +9089,17 @@
         <w:t xml:space="preserve">Appendix</w:t>
       </w:r>
     </w:p>
-    <w:bookmarkStart w:id="68" w:name="tab:supp_analysis_parameters"/>
+    <w:bookmarkEnd w:id="69"/>
+    <w:bookmarkStart w:id="145" w:name="appendix-1"/>
+    <w:p>
+      <w:pPr>
+        <w:pStyle w:val="Heading1"/>
+      </w:pPr>
+      <w:r>
+        <w:t xml:space="preserve">Appendix</w:t>
+      </w:r>
+    </w:p>
+    <w:bookmarkStart w:id="70" w:name="tab:supp_analysis_parameters"/>
     <w:p>
       <w:pPr>
         <w:pStyle w:val="TableCaption"/>
@@ -9533,7 +9428,7 @@
               <w:jc w:val="left"/>
             </w:pPr>
             <w:r>
-              <w:t xml:space="preserve">Buenrostro and ENCODE replicate footprint tracks analyzed with repeated condition labels, JASPAR 2026 motifs, and replicate reporting enabled. Runs include no-normalization and sample-quantile-normalized distribution-comparison settings where indicated; replicate-supported motif-score matrix reviews additionally use the limma-like empirical-Bayes view.</w:t>
+              <w:t xml:space="preserve">Buenrostro and ENCODE replicate footprint tracks analyzed with repeated condition labels, JASPAR 2026 motifs, and replicate reporting enabled. One-sample contrasts use motif-site versus background-distribution comparison; replicate-supported analyses use empirical-Bayes variance moderation on per-sample aggregated motif scores.</w:t>
             </w:r>
           </w:p>
         </w:tc>
@@ -9613,7 +9508,7 @@
               <w:jc w:val="left"/>
             </w:pPr>
             <w:r>
-              <w:t xml:space="preserve">Pseudobulk PBMC workflow</w:t>
+              <w:t xml:space="preserve">Pseudobulk PBMC analysis</w:t>
             </w:r>
           </w:p>
         </w:tc>
@@ -9640,14 +9535,14 @@
               <w:t xml:space="preserve"> </w:t>
             </w:r>
             <w:r>
-              <w:t xml:space="preserve">route writes pseudo-BAMs, runs ATAC correction with zero read shifting for fragment-derived pseudobulk BAMs, and emits footprint-score tracks, motif-aware differential results, and aggregate plots. The PBMC5k demonstration uses broad B-cell/monocyte/T–NK labels, marker sites, pairwise volcano plots, and KNN-smoothed footprint-signature UMAPs.</w:t>
+              <w:t xml:space="preserve">route writes pseudo-BAMs, runs ATAC correction with zero read shifting for fragment-derived pseudobulk BAMs, and emits footprint-score tracks, motif-aware differential results, and aggregate plots. The PBMC5k example uses broad B-cell/monocyte/T–NK labels, marker sites, pairwise volcano plots, and KNN-smoothed footprint-signature UMAPs.</w:t>
             </w:r>
           </w:p>
         </w:tc>
       </w:tr>
     </w:tbl>
-    <w:bookmarkEnd w:id="68"/>
-    <w:bookmarkStart w:id="69" w:name="tab:supp_software_versions"/>
+    <w:bookmarkEnd w:id="70"/>
+    <w:bookmarkStart w:id="71" w:name="tab:supp_software_versions"/>
     <w:p>
       <w:pPr>
         <w:pStyle w:val="TableCaption"/>
@@ -10549,9 +10444,9 @@
         </w:tc>
       </w:tr>
     </w:tbl>
-    <w:bookmarkEnd w:id="69"/>
-    <w:bookmarkStart w:id="140" w:name="refs"/>
-    <w:bookmarkStart w:id="71" w:name="ref-buenrostro2013"/>
+    <w:bookmarkEnd w:id="71"/>
+    <w:bookmarkStart w:id="144" w:name="refs"/>
+    <w:bookmarkStart w:id="73" w:name="ref-buenrostro2013"/>
     <w:p>
       <w:pPr>
         <w:pStyle w:val="Bibliography"/>
@@ -10571,7 +10466,7 @@
       <w:r>
         <w:t xml:space="preserve"> </w:t>
       </w:r>
-      <w:hyperlink r:id="rId70">
+      <w:hyperlink r:id="rId72">
         <w:r>
           <w:rPr>
             <w:rStyle w:val="Hyperlink"/>
@@ -10604,8 +10499,8 @@
         <w:t xml:space="preserve"> </w:t>
       </w:r>
     </w:p>
-    <w:bookmarkEnd w:id="71"/>
-    <w:bookmarkStart w:id="73" w:name="ref-pique2011centipede"/>
+    <w:bookmarkEnd w:id="73"/>
+    <w:bookmarkStart w:id="75" w:name="ref-pique2011centipede"/>
     <w:p>
       <w:pPr>
         <w:pStyle w:val="Bibliography"/>
@@ -10625,7 +10520,7 @@
       <w:r>
         <w:t xml:space="preserve"> </w:t>
       </w:r>
-      <w:hyperlink r:id="rId72">
+      <w:hyperlink r:id="rId74">
         <w:r>
           <w:rPr>
             <w:rStyle w:val="Hyperlink"/>
@@ -10664,8 +10559,8 @@
         <w:t xml:space="preserve"> </w:t>
       </w:r>
     </w:p>
-    <w:bookmarkEnd w:id="73"/>
-    <w:bookmarkStart w:id="75" w:name="ref-piper2013wellington"/>
+    <w:bookmarkEnd w:id="75"/>
+    <w:bookmarkStart w:id="77" w:name="ref-piper2013wellington"/>
     <w:p>
       <w:pPr>
         <w:pStyle w:val="Bibliography"/>
@@ -10685,7 +10580,7 @@
       <w:r>
         <w:t xml:space="preserve"> </w:t>
       </w:r>
-      <w:hyperlink r:id="rId74">
+      <w:hyperlink r:id="rId76">
         <w:r>
           <w:rPr>
             <w:rStyle w:val="Hyperlink"/>
@@ -10724,8 +10619,8 @@
         <w:t xml:space="preserve"> </w:t>
       </w:r>
     </w:p>
-    <w:bookmarkEnd w:id="75"/>
-    <w:bookmarkStart w:id="77" w:name="ref-sherwood2014piq"/>
+    <w:bookmarkEnd w:id="77"/>
+    <w:bookmarkStart w:id="79" w:name="ref-sherwood2014piq"/>
     <w:p>
       <w:pPr>
         <w:pStyle w:val="Bibliography"/>
@@ -10745,7 +10640,7 @@
       <w:r>
         <w:t xml:space="preserve"> </w:t>
       </w:r>
-      <w:hyperlink r:id="rId76">
+      <w:hyperlink r:id="rId78">
         <w:r>
           <w:rPr>
             <w:rStyle w:val="Hyperlink"/>
@@ -10784,8 +10679,8 @@
         <w:t xml:space="preserve"> </w:t>
       </w:r>
     </w:p>
-    <w:bookmarkEnd w:id="77"/>
-    <w:bookmarkStart w:id="79" w:name="ref-quach2017defcom"/>
+    <w:bookmarkEnd w:id="79"/>
+    <w:bookmarkStart w:id="81" w:name="ref-quach2017defcom"/>
     <w:p>
       <w:pPr>
         <w:pStyle w:val="Bibliography"/>
@@ -10805,7 +10700,7 @@
       <w:r>
         <w:t xml:space="preserve"> </w:t>
       </w:r>
-      <w:hyperlink r:id="rId78">
+      <w:hyperlink r:id="rId80">
         <w:r>
           <w:rPr>
             <w:rStyle w:val="Hyperlink"/>
@@ -10826,8 +10721,8 @@
         <w:t xml:space="preserve"> </w:t>
       </w:r>
     </w:p>
-    <w:bookmarkEnd w:id="79"/>
-    <w:bookmarkStart w:id="81" w:name="ref-bentsen2020"/>
+    <w:bookmarkEnd w:id="81"/>
+    <w:bookmarkStart w:id="83" w:name="ref-bentsen2020"/>
     <w:p>
       <w:pPr>
         <w:pStyle w:val="Bibliography"/>
@@ -10847,7 +10742,7 @@
       <w:r>
         <w:t xml:space="preserve"> </w:t>
       </w:r>
-      <w:hyperlink r:id="rId80">
+      <w:hyperlink r:id="rId82">
         <w:r>
           <w:rPr>
             <w:rStyle w:val="Hyperlink"/>
@@ -10868,8 +10763,8 @@
         <w:t xml:space="preserve"> </w:t>
       </w:r>
     </w:p>
-    <w:bookmarkEnd w:id="81"/>
-    <w:bookmarkStart w:id="83" w:name="ref-li2019hint"/>
+    <w:bookmarkEnd w:id="83"/>
+    <w:bookmarkStart w:id="85" w:name="ref-li2019hint"/>
     <w:p>
       <w:pPr>
         <w:pStyle w:val="Bibliography"/>
@@ -10889,7 +10784,7 @@
       <w:r>
         <w:t xml:space="preserve"> </w:t>
       </w:r>
-      <w:hyperlink r:id="rId82">
+      <w:hyperlink r:id="rId84">
         <w:r>
           <w:rPr>
             <w:rStyle w:val="Hyperlink"/>
@@ -10922,8 +10817,8 @@
         <w:t xml:space="preserve"> </w:t>
       </w:r>
     </w:p>
-    <w:bookmarkEnd w:id="83"/>
-    <w:bookmarkStart w:id="85" w:name="ref-hu2024print"/>
+    <w:bookmarkEnd w:id="85"/>
+    <w:bookmarkStart w:id="87" w:name="ref-hu2024print"/>
     <w:p>
       <w:pPr>
         <w:pStyle w:val="Bibliography"/>
@@ -10943,7 +10838,7 @@
       <w:r>
         <w:t xml:space="preserve"> </w:t>
       </w:r>
-      <w:hyperlink r:id="rId84">
+      <w:hyperlink r:id="rId86">
         <w:r>
           <w:rPr>
             <w:rStyle w:val="Hyperlink"/>
@@ -10958,8 +10853,8 @@
         <w:t xml:space="preserve"> </w:t>
       </w:r>
     </w:p>
-    <w:bookmarkEnd w:id="85"/>
-    <w:bookmarkStart w:id="87" w:name="ref-cazares2023maxatac"/>
+    <w:bookmarkEnd w:id="87"/>
+    <w:bookmarkStart w:id="89" w:name="ref-cazares2023maxatac"/>
     <w:p>
       <w:pPr>
         <w:pStyle w:val="Bibliography"/>
@@ -10979,7 +10874,7 @@
       <w:r>
         <w:t xml:space="preserve"> </w:t>
       </w:r>
-      <w:hyperlink r:id="rId86">
+      <w:hyperlink r:id="rId88">
         <w:r>
           <w:rPr>
             <w:rStyle w:val="Hyperlink"/>
@@ -11018,8 +10913,8 @@
         <w:t xml:space="preserve"> </w:t>
       </w:r>
     </w:p>
-    <w:bookmarkEnd w:id="87"/>
-    <w:bookmarkStart w:id="89" w:name="ref-chrombpnet2024"/>
+    <w:bookmarkEnd w:id="89"/>
+    <w:bookmarkStart w:id="91" w:name="ref-chrombpnet2024"/>
     <w:p>
       <w:pPr>
         <w:pStyle w:val="Bibliography"/>
@@ -11039,7 +10934,7 @@
       <w:r>
         <w:t xml:space="preserve"> </w:t>
       </w:r>
-      <w:hyperlink r:id="rId88">
+      <w:hyperlink r:id="rId90">
         <w:r>
           <w:rPr>
             <w:rStyle w:val="Hyperlink"/>
@@ -11060,8 +10955,8 @@
         <w:t xml:space="preserve"> </w:t>
       </w:r>
     </w:p>
-    <w:bookmarkEnd w:id="89"/>
-    <w:bookmarkStart w:id="91" w:name="ref-bailey2015meme"/>
+    <w:bookmarkEnd w:id="91"/>
+    <w:bookmarkStart w:id="93" w:name="ref-bailey2015meme"/>
     <w:p>
       <w:pPr>
         <w:pStyle w:val="Bibliography"/>
@@ -11081,7 +10976,7 @@
       <w:r>
         <w:t xml:space="preserve"> </w:t>
       </w:r>
-      <w:hyperlink r:id="rId90">
+      <w:hyperlink r:id="rId92">
         <w:r>
           <w:rPr>
             <w:rStyle w:val="Hyperlink"/>
@@ -11120,8 +11015,8 @@
         <w:t xml:space="preserve"> </w:t>
       </w:r>
     </w:p>
-    <w:bookmarkEnd w:id="91"/>
-    <w:bookmarkStart w:id="93" w:name="ref-Bailey2021_STREME"/>
+    <w:bookmarkEnd w:id="93"/>
+    <w:bookmarkStart w:id="95" w:name="ref-Bailey2021_STREME"/>
     <w:p>
       <w:pPr>
         <w:pStyle w:val="Bibliography"/>
@@ -11141,7 +11036,7 @@
       <w:r>
         <w:t xml:space="preserve"> </w:t>
       </w:r>
-      <w:hyperlink r:id="rId92">
+      <w:hyperlink r:id="rId94">
         <w:r>
           <w:rPr>
             <w:rStyle w:val="Hyperlink"/>
@@ -11156,8 +11051,8 @@
         <w:t xml:space="preserve"> </w:t>
       </w:r>
     </w:p>
-    <w:bookmarkEnd w:id="93"/>
-    <w:bookmarkStart w:id="95" w:name="ref-gupta2007tomtom"/>
+    <w:bookmarkEnd w:id="95"/>
+    <w:bookmarkStart w:id="97" w:name="ref-gupta2007tomtom"/>
     <w:p>
       <w:pPr>
         <w:pStyle w:val="Bibliography"/>
@@ -11177,7 +11072,7 @@
       <w:r>
         <w:t xml:space="preserve"> </w:t>
       </w:r>
-      <w:hyperlink r:id="rId94">
+      <w:hyperlink r:id="rId96">
         <w:r>
           <w:rPr>
             <w:rStyle w:val="Hyperlink"/>
@@ -11192,8 +11087,8 @@
         <w:t xml:space="preserve"> </w:t>
       </w:r>
     </w:p>
-    <w:bookmarkEnd w:id="95"/>
-    <w:bookmarkStart w:id="97" w:name="ref-jaspar2026"/>
+    <w:bookmarkEnd w:id="97"/>
+    <w:bookmarkStart w:id="99" w:name="ref-jaspar2026"/>
     <w:p>
       <w:pPr>
         <w:pStyle w:val="Bibliography"/>
@@ -11225,7 +11120,7 @@
       <w:r>
         <w:t xml:space="preserve"> </w:t>
       </w:r>
-      <w:hyperlink r:id="rId96">
+      <w:hyperlink r:id="rId98">
         <w:r>
           <w:rPr>
             <w:rStyle w:val="Hyperlink"/>
@@ -11234,8 +11129,8 @@
         </w:r>
       </w:hyperlink>
     </w:p>
-    <w:bookmarkEnd w:id="97"/>
-    <w:bookmarkStart w:id="99" w:name="ref-Bailey2011_DREME"/>
+    <w:bookmarkEnd w:id="99"/>
+    <w:bookmarkStart w:id="101" w:name="ref-Bailey2011_DREME"/>
     <w:p>
       <w:pPr>
         <w:pStyle w:val="Bibliography"/>
@@ -11255,7 +11150,7 @@
       <w:r>
         <w:t xml:space="preserve"> </w:t>
       </w:r>
-      <w:hyperlink r:id="rId98">
+      <w:hyperlink r:id="rId100">
         <w:r>
           <w:rPr>
             <w:rStyle w:val="Hyperlink"/>
@@ -11270,8 +11165,8 @@
         <w:t xml:space="preserve"> </w:t>
       </w:r>
     </w:p>
-    <w:bookmarkEnd w:id="99"/>
-    <w:bookmarkStart w:id="101" w:name="ref-Chen2018_fastp"/>
+    <w:bookmarkEnd w:id="101"/>
+    <w:bookmarkStart w:id="103" w:name="ref-smyth2004"/>
     <w:p>
       <w:pPr>
         <w:pStyle w:val="Bibliography"/>
@@ -11286,12 +11181,72 @@
         <w:t xml:space="preserve">	</w:t>
       </w:r>
       <w:r>
+        <w:t xml:space="preserve">Smyth GK.</w:t>
+      </w:r>
+      <w:r>
+        <w:t xml:space="preserve"> </w:t>
+      </w:r>
+      <w:hyperlink r:id="rId102">
+        <w:r>
+          <w:rPr>
+            <w:rStyle w:val="Hyperlink"/>
+          </w:rPr>
+          <w:t xml:space="preserve">Linear models and empirical</w:t>
+        </w:r>
+        <w:r>
+          <w:rPr>
+            <w:rStyle w:val="Hyperlink"/>
+          </w:rPr>
+          <w:t xml:space="preserve"> </w:t>
+        </w:r>
+        <w:r>
+          <w:rPr>
+            <w:rStyle w:val="Hyperlink"/>
+          </w:rPr>
+          <w:t xml:space="preserve">Bayes</w:t>
+        </w:r>
+        <w:r>
+          <w:rPr>
+            <w:rStyle w:val="Hyperlink"/>
+          </w:rPr>
+          <w:t xml:space="preserve"> </w:t>
+        </w:r>
+        <w:r>
+          <w:rPr>
+            <w:rStyle w:val="Hyperlink"/>
+          </w:rPr>
+          <w:t xml:space="preserve">methods for assessing differential expression in microarray experiments</w:t>
+        </w:r>
+      </w:hyperlink>
+      <w:r>
+        <w:t xml:space="preserve">. Statistical Applications in Genetics and Molecular Biology. 2004;3(1):Article 3.</w:t>
+      </w:r>
+      <w:r>
+        <w:t xml:space="preserve"> </w:t>
+      </w:r>
+    </w:p>
+    <w:bookmarkEnd w:id="103"/>
+    <w:bookmarkStart w:id="105" w:name="ref-Chen2018_fastp"/>
+    <w:p>
+      <w:pPr>
+        <w:pStyle w:val="Bibliography"/>
+      </w:pPr>
+      <w:r>
+        <w:t xml:space="preserve">17.</w:t>
+      </w:r>
+      <w:r>
+        <w:t xml:space="preserve"> </w:t>
+      </w:r>
+      <w:r>
+        <w:t xml:space="preserve">	</w:t>
+      </w:r>
+      <w:r>
         <w:t xml:space="preserve">Chen S, Zhou Y, Chen Y, Gu J.</w:t>
       </w:r>
       <w:r>
         <w:t xml:space="preserve"> </w:t>
       </w:r>
-      <w:hyperlink r:id="rId100">
+      <w:hyperlink r:id="rId104">
         <w:r>
           <w:rPr>
             <w:rStyle w:val="Hyperlink"/>
@@ -11306,14 +11261,14 @@
         <w:t xml:space="preserve"> </w:t>
       </w:r>
     </w:p>
-    <w:bookmarkEnd w:id="101"/>
-    <w:bookmarkStart w:id="103" w:name="ref-Langmead2012_Bowtie2"/>
+    <w:bookmarkEnd w:id="105"/>
+    <w:bookmarkStart w:id="107" w:name="ref-Langmead2012_Bowtie2"/>
     <w:p>
       <w:pPr>
         <w:pStyle w:val="Bibliography"/>
       </w:pPr>
       <w:r>
-        <w:t xml:space="preserve">17.</w:t>
+        <w:t xml:space="preserve">18.</w:t>
       </w:r>
       <w:r>
         <w:t xml:space="preserve"> </w:t>
@@ -11327,7 +11282,7 @@
       <w:r>
         <w:t xml:space="preserve"> </w:t>
       </w:r>
-      <w:hyperlink r:id="rId102">
+      <w:hyperlink r:id="rId106">
         <w:r>
           <w:rPr>
             <w:rStyle w:val="Hyperlink"/>
@@ -11342,14 +11297,14 @@
         <w:t xml:space="preserve"> </w:t>
       </w:r>
     </w:p>
-    <w:bookmarkEnd w:id="103"/>
-    <w:bookmarkStart w:id="105" w:name="ref-Li2009_SAMtools"/>
+    <w:bookmarkEnd w:id="107"/>
+    <w:bookmarkStart w:id="109" w:name="ref-Li2009_SAMtools"/>
     <w:p>
       <w:pPr>
         <w:pStyle w:val="Bibliography"/>
       </w:pPr>
       <w:r>
-        <w:t xml:space="preserve">18.</w:t>
+        <w:t xml:space="preserve">19.</w:t>
       </w:r>
       <w:r>
         <w:t xml:space="preserve"> </w:t>
@@ -11363,7 +11318,7 @@
       <w:r>
         <w:t xml:space="preserve"> </w:t>
       </w:r>
-      <w:hyperlink r:id="rId104">
+      <w:hyperlink r:id="rId108">
         <w:r>
           <w:rPr>
             <w:rStyle w:val="Hyperlink"/>
@@ -11378,14 +11333,14 @@
         <w:t xml:space="preserve"> </w:t>
       </w:r>
     </w:p>
-    <w:bookmarkEnd w:id="105"/>
-    <w:bookmarkStart w:id="107" w:name="ref-Quinlan2010_BEDTools"/>
+    <w:bookmarkEnd w:id="109"/>
+    <w:bookmarkStart w:id="111" w:name="ref-Quinlan2010_BEDTools"/>
     <w:p>
       <w:pPr>
         <w:pStyle w:val="Bibliography"/>
       </w:pPr>
       <w:r>
-        <w:t xml:space="preserve">19.</w:t>
+        <w:t xml:space="preserve">20.</w:t>
       </w:r>
       <w:r>
         <w:t xml:space="preserve"> </w:t>
@@ -11399,7 +11354,7 @@
       <w:r>
         <w:t xml:space="preserve"> </w:t>
       </w:r>
-      <w:hyperlink r:id="rId106">
+      <w:hyperlink r:id="rId110">
         <w:r>
           <w:rPr>
             <w:rStyle w:val="Hyperlink"/>
@@ -11414,14 +11369,14 @@
         <w:t xml:space="preserve"> </w:t>
       </w:r>
     </w:p>
-    <w:bookmarkEnd w:id="107"/>
-    <w:bookmarkStart w:id="109" w:name="ref-Zhang2008_MACS"/>
+    <w:bookmarkEnd w:id="111"/>
+    <w:bookmarkStart w:id="113" w:name="ref-Zhang2008_MACS"/>
     <w:p>
       <w:pPr>
         <w:pStyle w:val="Bibliography"/>
       </w:pPr>
       <w:r>
-        <w:t xml:space="preserve">20.</w:t>
+        <w:t xml:space="preserve">21.</w:t>
       </w:r>
       <w:r>
         <w:t xml:space="preserve"> </w:t>
@@ -11435,7 +11390,7 @@
       <w:r>
         <w:t xml:space="preserve"> </w:t>
       </w:r>
-      <w:hyperlink r:id="rId108">
+      <w:hyperlink r:id="rId112">
         <w:r>
           <w:rPr>
             <w:rStyle w:val="Hyperlink"/>
@@ -11450,14 +11405,14 @@
         <w:t xml:space="preserve"> </w:t>
       </w:r>
     </w:p>
-    <w:bookmarkEnd w:id="109"/>
-    <w:bookmarkStart w:id="111" w:name="ref-Amemiya2019_Blacklist"/>
+    <w:bookmarkEnd w:id="113"/>
+    <w:bookmarkStart w:id="115" w:name="ref-Amemiya2019_Blacklist"/>
     <w:p>
       <w:pPr>
         <w:pStyle w:val="Bibliography"/>
       </w:pPr>
       <w:r>
-        <w:t xml:space="preserve">21.</w:t>
+        <w:t xml:space="preserve">22.</w:t>
       </w:r>
       <w:r>
         <w:t xml:space="preserve"> </w:t>
@@ -11471,7 +11426,7 @@
       <w:r>
         <w:t xml:space="preserve"> </w:t>
       </w:r>
-      <w:hyperlink r:id="rId110">
+      <w:hyperlink r:id="rId114">
         <w:r>
           <w:rPr>
             <w:rStyle w:val="Hyperlink"/>
@@ -11486,14 +11441,14 @@
         <w:t xml:space="preserve"> </w:t>
       </w:r>
     </w:p>
-    <w:bookmarkEnd w:id="111"/>
-    <w:bookmarkStart w:id="113" w:name="ref-encode2012"/>
+    <w:bookmarkEnd w:id="115"/>
+    <w:bookmarkStart w:id="117" w:name="ref-encode2012"/>
     <w:p>
       <w:pPr>
         <w:pStyle w:val="Bibliography"/>
       </w:pPr>
       <w:r>
-        <w:t xml:space="preserve">22.</w:t>
+        <w:t xml:space="preserve">23.</w:t>
       </w:r>
       <w:r>
         <w:t xml:space="preserve"> </w:t>
@@ -11507,7 +11462,7 @@
       <w:r>
         <w:t xml:space="preserve"> </w:t>
       </w:r>
-      <w:hyperlink r:id="rId112">
+      <w:hyperlink r:id="rId116">
         <w:r>
           <w:rPr>
             <w:rStyle w:val="Hyperlink"/>
@@ -11546,14 +11501,14 @@
         <w:t xml:space="preserve"> </w:t>
       </w:r>
     </w:p>
-    <w:bookmarkEnd w:id="113"/>
-    <w:bookmarkStart w:id="115" w:name="ref-Weber2019_Benchmarking"/>
+    <w:bookmarkEnd w:id="117"/>
+    <w:bookmarkStart w:id="119" w:name="ref-Weber2019_Benchmarking"/>
     <w:p>
       <w:pPr>
         <w:pStyle w:val="Bibliography"/>
       </w:pPr>
       <w:r>
-        <w:t xml:space="preserve">23.</w:t>
+        <w:t xml:space="preserve">24.</w:t>
       </w:r>
       <w:r>
         <w:t xml:space="preserve"> </w:t>
@@ -11567,7 +11522,7 @@
       <w:r>
         <w:t xml:space="preserve"> </w:t>
       </w:r>
-      <w:hyperlink r:id="rId114">
+      <w:hyperlink r:id="rId118">
         <w:r>
           <w:rPr>
             <w:rStyle w:val="Hyperlink"/>
@@ -11582,14 +11537,14 @@
         <w:t xml:space="preserve"> </w:t>
       </w:r>
     </w:p>
-    <w:bookmarkEnd w:id="115"/>
-    <w:bookmarkStart w:id="117" w:name="ref-Mangul2019_SystematicBenchmarking"/>
+    <w:bookmarkEnd w:id="119"/>
+    <w:bookmarkStart w:id="121" w:name="ref-Mangul2019_SystematicBenchmarking"/>
     <w:p>
       <w:pPr>
         <w:pStyle w:val="Bibliography"/>
       </w:pPr>
       <w:r>
-        <w:t xml:space="preserve">24.</w:t>
+        <w:t xml:space="preserve">25.</w:t>
       </w:r>
       <w:r>
         <w:t xml:space="preserve"> </w:t>
@@ -11603,7 +11558,7 @@
       <w:r>
         <w:t xml:space="preserve"> </w:t>
       </w:r>
-      <w:hyperlink r:id="rId116">
+      <w:hyperlink r:id="rId120">
         <w:r>
           <w:rPr>
             <w:rStyle w:val="Hyperlink"/>
@@ -11618,14 +11573,14 @@
         <w:t xml:space="preserve"> </w:t>
       </w:r>
     </w:p>
-    <w:bookmarkEnd w:id="117"/>
-    <w:bookmarkStart w:id="119" w:name="ref-Wilkinson2016_FAIR"/>
+    <w:bookmarkEnd w:id="121"/>
+    <w:bookmarkStart w:id="123" w:name="ref-Wilkinson2016_FAIR"/>
     <w:p>
       <w:pPr>
         <w:pStyle w:val="Bibliography"/>
       </w:pPr>
       <w:r>
-        <w:t xml:space="preserve">25.</w:t>
+        <w:t xml:space="preserve">26.</w:t>
       </w:r>
       <w:r>
         <w:t xml:space="preserve"> </w:t>
@@ -11639,7 +11594,7 @@
       <w:r>
         <w:t xml:space="preserve"> </w:t>
       </w:r>
-      <w:hyperlink r:id="rId118">
+      <w:hyperlink r:id="rId122">
         <w:r>
           <w:rPr>
             <w:rStyle w:val="Hyperlink"/>
@@ -11654,14 +11609,14 @@
         <w:t xml:space="preserve"> </w:t>
       </w:r>
     </w:p>
-    <w:bookmarkEnd w:id="119"/>
-    <w:bookmarkStart w:id="121" w:name="ref-Gruning2018_Bioconda"/>
+    <w:bookmarkEnd w:id="123"/>
+    <w:bookmarkStart w:id="125" w:name="ref-Gruning2018_Bioconda"/>
     <w:p>
       <w:pPr>
         <w:pStyle w:val="Bibliography"/>
       </w:pPr>
       <w:r>
-        <w:t xml:space="preserve">26.</w:t>
+        <w:t xml:space="preserve">27.</w:t>
       </w:r>
       <w:r>
         <w:t xml:space="preserve"> </w:t>
@@ -11675,7 +11630,7 @@
       <w:r>
         <w:t xml:space="preserve"> </w:t>
       </w:r>
-      <w:hyperlink r:id="rId120">
+      <w:hyperlink r:id="rId124">
         <w:r>
           <w:rPr>
             <w:rStyle w:val="Hyperlink"/>
@@ -11690,14 +11645,14 @@
         <w:t xml:space="preserve"> </w:t>
       </w:r>
     </w:p>
-    <w:bookmarkEnd w:id="121"/>
-    <w:bookmarkStart w:id="123" w:name="ref-Ewels2020_nfcore"/>
+    <w:bookmarkEnd w:id="125"/>
+    <w:bookmarkStart w:id="127" w:name="ref-Ewels2020_nfcore"/>
     <w:p>
       <w:pPr>
         <w:pStyle w:val="Bibliography"/>
       </w:pPr>
       <w:r>
-        <w:t xml:space="preserve">27.</w:t>
+        <w:t xml:space="preserve">28.</w:t>
       </w:r>
       <w:r>
         <w:t xml:space="preserve"> </w:t>
@@ -11711,7 +11666,7 @@
       <w:r>
         <w:t xml:space="preserve"> </w:t>
       </w:r>
-      <w:hyperlink r:id="rId122">
+      <w:hyperlink r:id="rId126">
         <w:r>
           <w:rPr>
             <w:rStyle w:val="Hyperlink"/>
@@ -11726,14 +11681,14 @@
         <w:t xml:space="preserve"> </w:t>
       </w:r>
     </w:p>
-    <w:bookmarkEnd w:id="123"/>
-    <w:bookmarkStart w:id="125" w:name="ref-koizumi2021junb"/>
+    <w:bookmarkEnd w:id="127"/>
+    <w:bookmarkStart w:id="129" w:name="ref-koizumi2021junb"/>
     <w:p>
       <w:pPr>
         <w:pStyle w:val="Bibliography"/>
       </w:pPr>
       <w:r>
-        <w:t xml:space="preserve">28.</w:t>
+        <w:t xml:space="preserve">29.</w:t>
       </w:r>
       <w:r>
         <w:t xml:space="preserve"> </w:t>
@@ -11747,7 +11702,7 @@
       <w:r>
         <w:t xml:space="preserve"> </w:t>
       </w:r>
-      <w:hyperlink r:id="rId124">
+      <w:hyperlink r:id="rId128">
         <w:r>
           <w:rPr>
             <w:rStyle w:val="Hyperlink"/>
@@ -11762,14 +11717,14 @@
         <w:t xml:space="preserve"> </w:t>
       </w:r>
     </w:p>
-    <w:bookmarkEnd w:id="125"/>
-    <w:bookmarkStart w:id="127" w:name="ref-andrews2020itk"/>
+    <w:bookmarkEnd w:id="129"/>
+    <w:bookmarkStart w:id="131" w:name="ref-andrews2020itk"/>
     <w:p>
       <w:pPr>
         <w:pStyle w:val="Bibliography"/>
       </w:pPr>
       <w:r>
-        <w:t xml:space="preserve">29.</w:t>
+        <w:t xml:space="preserve">30.</w:t>
       </w:r>
       <w:r>
         <w:t xml:space="preserve"> </w:t>
@@ -11783,7 +11738,7 @@
       <w:r>
         <w:t xml:space="preserve"> </w:t>
       </w:r>
-      <w:hyperlink r:id="rId126">
+      <w:hyperlink r:id="rId130">
         <w:r>
           <w:rPr>
             <w:rStyle w:val="Hyperlink"/>
@@ -11798,14 +11753,14 @@
         <w:t xml:space="preserve"> </w:t>
       </w:r>
     </w:p>
-    <w:bookmarkEnd w:id="127"/>
-    <w:bookmarkStart w:id="129" w:name="ref-tenxpbmc2021"/>
+    <w:bookmarkEnd w:id="131"/>
+    <w:bookmarkStart w:id="133" w:name="ref-tenxpbmc2021"/>
     <w:p>
       <w:pPr>
         <w:pStyle w:val="Bibliography"/>
       </w:pPr>
       <w:r>
-        <w:t xml:space="preserve">30.</w:t>
+        <w:t xml:space="preserve">31.</w:t>
       </w:r>
       <w:r>
         <w:t xml:space="preserve"> </w:t>
@@ -11834,7 +11789,7 @@
       <w:r>
         <w:t xml:space="preserve"> </w:t>
       </w:r>
-      <w:hyperlink r:id="rId128">
+      <w:hyperlink r:id="rId132">
         <w:r>
           <w:rPr>
             <w:rStyle w:val="Hyperlink"/>
@@ -11843,14 +11798,14 @@
         </w:r>
       </w:hyperlink>
     </w:p>
-    <w:bookmarkEnd w:id="129"/>
-    <w:bookmarkStart w:id="131" w:name="ref-Granja2021_ArchR"/>
+    <w:bookmarkEnd w:id="133"/>
+    <w:bookmarkStart w:id="135" w:name="ref-Granja2021_ArchR"/>
     <w:p>
       <w:pPr>
         <w:pStyle w:val="Bibliography"/>
       </w:pPr>
       <w:r>
-        <w:t xml:space="preserve">31.</w:t>
+        <w:t xml:space="preserve">32.</w:t>
       </w:r>
       <w:r>
         <w:t xml:space="preserve"> </w:t>
@@ -11864,7 +11819,7 @@
       <w:r>
         <w:t xml:space="preserve"> </w:t>
       </w:r>
-      <w:hyperlink r:id="rId130">
+      <w:hyperlink r:id="rId134">
         <w:r>
           <w:rPr>
             <w:rStyle w:val="Hyperlink"/>
@@ -11879,14 +11834,14 @@
         <w:t xml:space="preserve"> </w:t>
       </w:r>
     </w:p>
-    <w:bookmarkEnd w:id="131"/>
-    <w:bookmarkStart w:id="133" w:name="ref-Stuart2021_Signac"/>
+    <w:bookmarkEnd w:id="135"/>
+    <w:bookmarkStart w:id="137" w:name="ref-Stuart2021_Signac"/>
     <w:p>
       <w:pPr>
         <w:pStyle w:val="Bibliography"/>
       </w:pPr>
       <w:r>
-        <w:t xml:space="preserve">32.</w:t>
+        <w:t xml:space="preserve">33.</w:t>
       </w:r>
       <w:r>
         <w:t xml:space="preserve"> </w:t>
@@ -11900,7 +11855,7 @@
       <w:r>
         <w:t xml:space="preserve"> </w:t>
       </w:r>
-      <w:hyperlink r:id="rId132">
+      <w:hyperlink r:id="rId136">
         <w:r>
           <w:rPr>
             <w:rStyle w:val="Hyperlink"/>
@@ -11915,14 +11870,14 @@
         <w:t xml:space="preserve"> </w:t>
       </w:r>
     </w:p>
-    <w:bookmarkEnd w:id="133"/>
-    <w:bookmarkStart w:id="135" w:name="ref-Schep2017_chromVAR"/>
+    <w:bookmarkEnd w:id="137"/>
+    <w:bookmarkStart w:id="139" w:name="ref-Schep2017_chromVAR"/>
     <w:p>
       <w:pPr>
         <w:pStyle w:val="Bibliography"/>
       </w:pPr>
       <w:r>
-        <w:t xml:space="preserve">33.</w:t>
+        <w:t xml:space="preserve">34.</w:t>
       </w:r>
       <w:r>
         <w:t xml:space="preserve"> </w:t>
@@ -11936,7 +11891,7 @@
       <w:r>
         <w:t xml:space="preserve"> </w:t>
       </w:r>
-      <w:hyperlink r:id="rId134">
+      <w:hyperlink r:id="rId138">
         <w:r>
           <w:rPr>
             <w:rStyle w:val="Hyperlink"/>
@@ -11951,14 +11906,14 @@
         <w:t xml:space="preserve"> </w:t>
       </w:r>
     </w:p>
-    <w:bookmarkEnd w:id="135"/>
-    <w:bookmarkStart w:id="137" w:name="ref-tenxpbmc5katac2021"/>
+    <w:bookmarkEnd w:id="139"/>
+    <w:bookmarkStart w:id="141" w:name="ref-tenxpbmc5katac2021"/>
     <w:p>
       <w:pPr>
         <w:pStyle w:val="Bibliography"/>
       </w:pPr>
       <w:r>
-        <w:t xml:space="preserve">34.</w:t>
+        <w:t xml:space="preserve">35.</w:t>
       </w:r>
       <w:r>
         <w:t xml:space="preserve"> </w:t>
@@ -11987,7 +11942,7 @@
       <w:r>
         <w:t xml:space="preserve"> </w:t>
       </w:r>
-      <w:hyperlink r:id="rId136">
+      <w:hyperlink r:id="rId140">
         <w:r>
           <w:rPr>
             <w:rStyle w:val="Hyperlink"/>
@@ -11996,14 +11951,14 @@
         </w:r>
       </w:hyperlink>
     </w:p>
-    <w:bookmarkEnd w:id="137"/>
-    <w:bookmarkStart w:id="139" w:name="ref-Berest2019_diffTF"/>
+    <w:bookmarkEnd w:id="141"/>
+    <w:bookmarkStart w:id="143" w:name="ref-Berest2019_diffTF"/>
     <w:p>
       <w:pPr>
         <w:pStyle w:val="Bibliography"/>
       </w:pPr>
       <w:r>
-        <w:t xml:space="preserve">35.</w:t>
+        <w:t xml:space="preserve">36.</w:t>
       </w:r>
       <w:r>
         <w:t xml:space="preserve"> </w:t>
@@ -12017,7 +11972,7 @@
       <w:r>
         <w:t xml:space="preserve"> </w:t>
       </w:r>
-      <w:hyperlink r:id="rId138">
+      <w:hyperlink r:id="rId142">
         <w:r>
           <w:rPr>
             <w:rStyle w:val="Hyperlink"/>
@@ -12032,9 +11987,9 @@
         <w:t xml:space="preserve"> </w:t>
       </w:r>
     </w:p>
-    <w:bookmarkEnd w:id="139"/>
-    <w:bookmarkEnd w:id="140"/>
-    <w:bookmarkEnd w:id="141"/>
+    <w:bookmarkEnd w:id="143"/>
+    <w:bookmarkEnd w:id="144"/>
+    <w:bookmarkEnd w:id="145"/>
     <w:sectPr>
       <w:footnotePr>
         <w:numRestart w:val="eachSect"/>

</xml_diff>

<commit_message>
Clarify manuscript output testing and discussion
</commit_message>
<xml_diff>
--- a/manuscript/main.docx
+++ b/manuscript/main.docx
@@ -2753,31 +2753,31 @@
         <w:pStyle w:val="FirstParagraph"/>
       </w:pPr>
       <w:r>
-        <w:t xml:space="preserve">The package includes unit tests for numerical helpers, CLI behavior, and</w:t>
-      </w:r>
-      <w:r>
-        <w:t xml:space="preserve"> </w:t>
-      </w:r>
-      <w:r>
-        <w:t xml:space="preserve">deterministic regression outputs for footprint calling, differential footprint</w:t>
-      </w:r>
-      <w:r>
-        <w:t xml:space="preserve"> </w:t>
-      </w:r>
-      <w:r>
-        <w:t xml:space="preserve">analysis, and aggregate plotting, with an opt-in slow regression for bias</w:t>
-      </w:r>
-      <w:r>
-        <w:t xml:space="preserve"> </w:t>
-      </w:r>
-      <w:r>
-        <w:t xml:space="preserve">correction. Continuous integration runs the suite on compact reference inputs,</w:t>
-      </w:r>
-      <w:r>
-        <w:t xml:space="preserve"> </w:t>
-      </w:r>
-      <w:r>
-        <w:t xml:space="preserve">builds source and wheel artifacts, and verifies the installed console scripts.</w:t>
+        <w:t xml:space="preserve">The package includes unit tests for numerical helpers and CLI behavior, plus</w:t>
+      </w:r>
+      <w:r>
+        <w:t xml:space="preserve"> </w:t>
+      </w:r>
+      <w:r>
+        <w:t xml:space="preserve">automated output checks for footprint calling, differential footprint analysis,</w:t>
+      </w:r>
+      <w:r>
+        <w:t xml:space="preserve"> </w:t>
+      </w:r>
+      <w:r>
+        <w:t xml:space="preserve">and aggregate plotting, with an opt-in slow check for bias correction.</w:t>
+      </w:r>
+      <w:r>
+        <w:t xml:space="preserve"> </w:t>
+      </w:r>
+      <w:r>
+        <w:t xml:space="preserve">Continuous integration runs the suite on compact reference inputs, builds source</w:t>
+      </w:r>
+      <w:r>
+        <w:t xml:space="preserve"> </w:t>
+      </w:r>
+      <w:r>
+        <w:t xml:space="preserve">and wheel artifacts, and verifies the installed console scripts.</w:t>
       </w:r>
       <w:r>
         <w:t xml:space="preserve"> </w:t>
@@ -3153,13 +3153,13 @@
       </w:r>
     </w:p>
     <w:bookmarkEnd w:id="24"/>
-    <w:bookmarkStart w:id="25" w:name="regression-tested-outputs"/>
+    <w:bookmarkStart w:id="25" w:name="tested-output-stability"/>
     <w:p>
       <w:pPr>
         <w:pStyle w:val="Heading2"/>
       </w:pPr>
       <w:r>
-        <w:t xml:space="preserve">Regression-tested Outputs</w:t>
+        <w:t xml:space="preserve">Tested Output Stability</w:t>
       </w:r>
     </w:p>
     <w:p>
@@ -3167,31 +3167,37 @@
         <w:pStyle w:val="FirstParagraph"/>
       </w:pPr>
       <w:r>
-        <w:t xml:space="preserve">Deterministic regression tests pin summary outputs for footprint calling,</w:t>
-      </w:r>
-      <w:r>
-        <w:t xml:space="preserve"> </w:t>
-      </w:r>
-      <w:r>
-        <w:t xml:space="preserve">differential footprint analysis, and aggregate plotting. Public entry-point</w:t>
-      </w:r>
-      <w:r>
-        <w:t xml:space="preserve"> </w:t>
-      </w:r>
-      <w:r>
-        <w:t xml:space="preserve">checks and YAML dry-runs verify that the command surface remains stable. These</w:t>
-      </w:r>
-      <w:r>
-        <w:t xml:space="preserve"> </w:t>
-      </w:r>
-      <w:r>
-        <w:t xml:space="preserve">tests provide a compact contract for core analyses while allowing integrated</w:t>
-      </w:r>
-      <w:r>
-        <w:t xml:space="preserve"> </w:t>
-      </w:r>
-      <w:r>
-        <w:t xml:space="preserve">modules to share the same input and output conventions.</w:t>
+        <w:t xml:space="preserve">The package includes automated checks that run core commands on compact</w:t>
+      </w:r>
+      <w:r>
+        <w:t xml:space="preserve"> </w:t>
+      </w:r>
+      <w:r>
+        <w:t xml:space="preserve">reference inputs and compare key summary outputs for footprint calling,</w:t>
+      </w:r>
+      <w:r>
+        <w:t xml:space="preserve"> </w:t>
+      </w:r>
+      <w:r>
+        <w:t xml:space="preserve">differential footprint analysis, and aggregate plotting. Additional checks</w:t>
+      </w:r>
+      <w:r>
+        <w:t xml:space="preserve"> </w:t>
+      </w:r>
+      <w:r>
+        <w:t xml:space="preserve">exercise public command-line entry points and saved YAML configurations.</w:t>
+      </w:r>
+      <w:r>
+        <w:t xml:space="preserve"> </w:t>
+      </w:r>
+      <w:r>
+        <w:t xml:space="preserve">Together, these tests help ensure that updates preserve the expected behavior of</w:t>
+      </w:r>
+      <w:r>
+        <w:t xml:space="preserve"> </w:t>
+      </w:r>
+      <w:r>
+        <w:t xml:space="preserve">the main workflows and shared input/output conventions.</w:t>
       </w:r>
     </w:p>
     <w:bookmarkEnd w:id="25"/>
@@ -4793,7 +4799,7 @@
         <w:t xml:space="preserve"> </w:t>
       </w:r>
       <w:r>
-        <w:t xml:space="preserve">analysis, and aggregate visualization; deterministic regression coverage;</w:t>
+        <w:t xml:space="preserve">analysis, and aggregate visualization; automated output checks;</w:t>
       </w:r>
       <w:r>
         <w:t xml:space="preserve"> </w:t>
@@ -4899,7 +4905,7 @@
         <w:t xml:space="preserve"> </w:t>
       </w:r>
       <w:r>
-        <w:t xml:space="preserve">single-cell aggregation, GUI access, and regression-tested example outputs.</w:t>
+        <w:t xml:space="preserve">single-cell aggregation, GUI access, and tested example outputs.</w:t>
       </w:r>
     </w:p>
     <w:bookmarkStart w:id="56" w:name="tab:features"/>
@@ -6171,37 +6177,55 @@
         <w:pStyle w:val="BodyText"/>
       </w:pPr>
       <w:r>
-        <w:t xml:space="preserve">Deep sequence-to-profile models such as ChromBPNet provide powerful</w:t>
-      </w:r>
-      <w:r>
-        <w:t xml:space="preserve"> </w:t>
-      </w:r>
-      <w:r>
-        <w:t xml:space="preserve">sequence-driven occupancy and variant-effect analyses </w:t>
+        <w:t xml:space="preserve">Other regulatory-analysis tools address adjacent but distinct questions. Deep</w:t>
+      </w:r>
+      <w:r>
+        <w:t xml:space="preserve"> </w:t>
+      </w:r>
+      <w:r>
+        <w:t xml:space="preserve">sequence-to-profile models such as ChromBPNet learn sequence determinants of</w:t>
+      </w:r>
+      <w:r>
+        <w:t xml:space="preserve"> </w:t>
+      </w:r>
+      <w:r>
+        <w:t xml:space="preserve">chromatin profiles and are well suited for occupancy and variant-effect</w:t>
+      </w:r>
+      <w:r>
+        <w:t xml:space="preserve"> </w:t>
+      </w:r>
+      <w:r>
+        <w:t xml:space="preserve">analyses </w:t>
       </w:r>
       <w:r>
         <w:t xml:space="preserve">(10)</w:t>
       </w:r>
       <w:r>
-        <w:t xml:space="preserve">.</w:t>
-      </w:r>
-      <w:r>
-        <w:t xml:space="preserve"> </w:t>
-      </w:r>
-      <w:r>
-        <w:t xml:space="preserve">Differential TF activity can also be studied with orthogonal accessibility-based</w:t>
-      </w:r>
-      <w:r>
-        <w:t xml:space="preserve"> </w:t>
-      </w:r>
-      <w:r>
-        <w:t xml:space="preserve">frameworks such as diffTF </w:t>
+        <w:t xml:space="preserve">, while accessibility-based frameworks such as</w:t>
+      </w:r>
+      <w:r>
+        <w:t xml:space="preserve"> </w:t>
+      </w:r>
+      <w:r>
+        <w:t xml:space="preserve">diffTF estimate differential TF activity from changes in open</w:t>
+      </w:r>
+      <w:r>
+        <w:t xml:space="preserve"> </w:t>
+      </w:r>
+      <w:r>
+        <w:t xml:space="preserve">chromatin </w:t>
       </w:r>
       <w:r>
         <w:t xml:space="preserve">(34)</w:t>
       </w:r>
       <w:r>
-        <w:t xml:space="preserve">. In this broader landscape,</w:t>
+        <w:t xml:space="preserve">. These approaches are complementary to</w:t>
+      </w:r>
+      <w:r>
+        <w:t xml:space="preserve"> </w:t>
+      </w:r>
+      <w:r>
+        <w:t xml:space="preserve">motif-centered footprinting. The role of</w:t>
       </w:r>
       <w:r>
         <w:t xml:space="preserve"> </w:t>
@@ -6216,37 +6240,31 @@
         <w:t xml:space="preserve"> </w:t>
       </w:r>
       <w:r>
-        <w:t xml:space="preserve">extends motif-centered ATAC footprinting by connecting corrected</w:t>
-      </w:r>
-      <w:r>
-        <w:t xml:space="preserve"> </w:t>
-      </w:r>
-      <w:r>
-        <w:t xml:space="preserve">cut-site profiles, motif interpretation, replicate-aware summaries, and</w:t>
-      </w:r>
-      <w:r>
-        <w:t xml:space="preserve"> </w:t>
-      </w:r>
-      <w:r>
-        <w:t xml:space="preserve">publication-ready reports. One-sample contrasts use the background-distribution</w:t>
-      </w:r>
-      <w:r>
-        <w:t xml:space="preserve"> </w:t>
-      </w:r>
-      <w:r>
-        <w:t xml:space="preserve">comparison, whereas replicate-supported contrasts use per-sample motif scores</w:t>
-      </w:r>
-      <w:r>
-        <w:t xml:space="preserve"> </w:t>
-      </w:r>
-      <w:r>
-        <w:t xml:space="preserve">with empirical-Bayes variance moderation to estimate differential footprint</w:t>
-      </w:r>
-      <w:r>
-        <w:t xml:space="preserve"> </w:t>
-      </w:r>
-      <w:r>
-        <w:t xml:space="preserve">statistics.</w:t>
+        <w:t xml:space="preserve">is to make</w:t>
+      </w:r>
+      <w:r>
+        <w:t xml:space="preserve"> </w:t>
+      </w:r>
+      <w:r>
+        <w:t xml:space="preserve">interpretable ATAC-seq footprint analysis easier to run end to end: corrected</w:t>
+      </w:r>
+      <w:r>
+        <w:t xml:space="preserve"> </w:t>
+      </w:r>
+      <w:r>
+        <w:t xml:space="preserve">cut-site signals, motif matching, de novo motif preparation, pseudobulk</w:t>
+      </w:r>
+      <w:r>
+        <w:t xml:space="preserve"> </w:t>
+      </w:r>
+      <w:r>
+        <w:t xml:space="preserve">single-cell analysis, replicate-aware reporting, GUI execution, and</w:t>
+      </w:r>
+      <w:r>
+        <w:t xml:space="preserve"> </w:t>
+      </w:r>
+      <w:r>
+        <w:t xml:space="preserve">publication-ready reports are kept within one reproducible workflow.</w:t>
       </w:r>
     </w:p>
     <w:bookmarkEnd w:id="57"/>

</xml_diff>

<commit_message>
Normalize manuscript DOCX styling
</commit_message>
<xml_diff>
--- a/manuscript/main.docx
+++ b/manuscript/main.docx
@@ -11220,14 +11220,15 @@
 </file>
 
 <file path=word/styles.xml><?xml version="1.0" encoding="utf-8"?>
-<w:styles xmlns:r="http://schemas.openxmlformats.org/officeDocument/2006/relationships" xmlns:w="http://schemas.openxmlformats.org/wordprocessingml/2006/main">
+<w:styles xmlns:w="http://schemas.openxmlformats.org/wordprocessingml/2006/main">
   <w:docDefaults>
     <w:rPrDefault>
       <w:rPr>
-        <w:rFonts w:asciiTheme="minorHAnsi" w:cstheme="minorBidi" w:eastAsiaTheme="minorHAnsi" w:hAnsiTheme="minorHAnsi"/>
-        <w:sz w:val="24"/>
-        <w:szCs w:val="24"/>
+        <w:rFonts w:ascii="Arial" w:hAnsi="Arial" w:eastAsia="Arial" w:cs="Arial"/>
+        <w:sz w:val="20"/>
+        <w:szCs w:val="20"/>
         <w:lang w:bidi="ar-SA" w:eastAsia="en-US" w:val="en-US"/>
+        <w:color w:val="000000"/>
       </w:rPr>
     </w:rPrDefault>
     <w:pPrDefault>
@@ -11240,29 +11241,59 @@
   <w:style w:default="1" w:styleId="Normal" w:type="paragraph">
     <w:name w:val="Normal"/>
     <w:qFormat/>
+    <w:rPr>
+      <w:rFonts w:ascii="Arial" w:hAnsi="Arial" w:eastAsia="Arial" w:cs="Arial"/>
+      <w:sz w:val="20"/>
+      <w:szCs w:val="20"/>
+      <w:color w:val="000000"/>
+    </w:rPr>
+    <w:pPr>
+      <w:spacing w:after="120" w:line="240" w:lineRule="auto"/>
+    </w:pPr>
   </w:style>
   <w:style w:styleId="BodyText" w:type="paragraph">
     <w:name w:val="Body Text"/>
     <w:basedOn w:val="Normal"/>
     <w:link w:val="BodyTextChar"/>
     <w:pPr>
-      <w:spacing w:after="180" w:before="180"/>
+      <w:spacing w:after="120" w:before="180" w:line="240" w:lineRule="auto"/>
     </w:pPr>
     <w:qFormat/>
+    <w:rPr>
+      <w:rFonts w:ascii="Arial" w:hAnsi="Arial" w:eastAsia="Arial" w:cs="Arial"/>
+      <w:sz w:val="20"/>
+      <w:szCs w:val="20"/>
+      <w:color w:val="000000"/>
+    </w:rPr>
   </w:style>
   <w:style w:customStyle="1" w:styleId="FirstParagraph" w:type="paragraph">
     <w:name w:val="First Paragraph"/>
     <w:basedOn w:val="BodyText"/>
     <w:next w:val="BodyText"/>
     <w:qFormat/>
+    <w:rPr>
+      <w:rFonts w:ascii="Arial" w:hAnsi="Arial" w:eastAsia="Arial" w:cs="Arial"/>
+      <w:sz w:val="20"/>
+      <w:szCs w:val="20"/>
+      <w:color w:val="000000"/>
+    </w:rPr>
+    <w:pPr>
+      <w:spacing w:after="120" w:line="240" w:lineRule="auto"/>
+    </w:pPr>
   </w:style>
   <w:style w:customStyle="1" w:styleId="Compact" w:type="paragraph">
     <w:name w:val="Compact"/>
     <w:basedOn w:val="BodyText"/>
     <w:qFormat/>
     <w:pPr>
-      <w:spacing w:after="36" w:before="36"/>
+      <w:spacing w:after="60" w:before="36" w:line="220" w:lineRule="auto"/>
     </w:pPr>
+    <w:rPr>
+      <w:rFonts w:ascii="Arial" w:hAnsi="Arial" w:eastAsia="Arial" w:cs="Arial"/>
+      <w:sz w:val="18"/>
+      <w:szCs w:val="18"/>
+      <w:color w:val="000000"/>
+    </w:rPr>
   </w:style>
   <w:style w:styleId="Title" w:type="paragraph">
     <w:name w:val="Title"/>
@@ -11272,16 +11303,16 @@
     <w:pPr>
       <w:keepNext/>
       <w:keepLines/>
-      <w:spacing w:after="240" w:before="480"/>
+      <w:spacing w:after="160" w:before="480" w:line="240" w:lineRule="auto"/>
       <w:jc w:val="center"/>
     </w:pPr>
     <w:rPr>
-      <w:rFonts w:asciiTheme="majorHAnsi" w:cstheme="majorBidi" w:eastAsiaTheme="majorEastAsia" w:hAnsiTheme="majorHAnsi"/>
+      <w:rFonts w:ascii="Arial" w:hAnsi="Arial" w:eastAsia="Arial" w:cs="Arial"/>
       <w:b/>
       <w:bCs/>
-      <w:color w:themeColor="accent1" w:themeShade="B5" w:val="345A8A"/>
-      <w:sz w:val="36"/>
-      <w:szCs w:val="36"/>
+      <w:color w:themeColor="accent1" w:themeShade="B5" w:val="000000"/>
+      <w:sz w:val="28"/>
+      <w:szCs w:val="28"/>
     </w:rPr>
   </w:style>
   <w:style w:styleId="Subtitle" w:type="paragraph">
@@ -11296,8 +11327,12 @@
       <w:jc w:val="center"/>
     </w:pPr>
     <w:rPr>
-      <w:sz w:val="30"/>
-      <w:szCs w:val="30"/>
+      <w:sz w:val="22"/>
+      <w:szCs w:val="22"/>
+      <w:rFonts w:ascii="Arial" w:hAnsi="Arial" w:eastAsia="Arial" w:cs="Arial"/>
+      <w:color w:val="000000"/>
+      <w:b/>
+      <w:bCs/>
     </w:rPr>
   </w:style>
   <w:style w:customStyle="1" w:styleId="Author" w:type="paragraph">
@@ -11308,7 +11343,14 @@
       <w:keepNext/>
       <w:keepLines/>
       <w:jc w:val="center"/>
+      <w:spacing w:after="120" w:line="240" w:lineRule="auto"/>
     </w:pPr>
+    <w:rPr>
+      <w:rFonts w:ascii="Arial" w:hAnsi="Arial" w:eastAsia="Arial" w:cs="Arial"/>
+      <w:sz w:val="20"/>
+      <w:szCs w:val="20"/>
+      <w:color w:val="000000"/>
+    </w:rPr>
   </w:style>
   <w:style w:styleId="Date" w:type="paragraph">
     <w:name w:val="Date"/>
@@ -11319,6 +11361,12 @@
       <w:keepLines/>
       <w:jc w:val="center"/>
     </w:pPr>
+    <w:rPr>
+      <w:rFonts w:ascii="Arial" w:hAnsi="Arial" w:eastAsia="Arial" w:cs="Arial"/>
+      <w:sz w:val="20"/>
+      <w:szCs w:val="20"/>
+      <w:color w:val="000000"/>
+    </w:rPr>
   </w:style>
   <w:style w:customStyle="1" w:styleId="AbstractTitle" w:type="paragraph">
     <w:name w:val="Abstract Title"/>
@@ -11329,14 +11377,16 @@
       <w:keepNext/>
       <w:keepLines/>
       <w:jc w:val="center"/>
-      <w:spacing w:after="0" w:before="300"/>
+      <w:spacing w:after="60" w:before="120" w:line="240" w:lineRule="auto"/>
     </w:pPr>
     <w:rPr>
       <w:sz w:val="20"/>
       <w:szCs w:val="20"/>
       <w:b/>
-      <w:color w:val="345A8A"/>
+      <w:color w:val="000000"/>
       &gt;
+      <w:rFonts w:ascii="Arial" w:hAnsi="Arial" w:eastAsia="Arial" w:cs="Arial"/>
+      <w:bCs/>
     </w:rPr>
   </w:style>
   <w:style w:customStyle="1" w:styleId="Abstract" w:type="paragraph">
@@ -11347,11 +11397,13 @@
     <w:pPr>
       <w:keepNext/>
       <w:keepLines/>
-      <w:spacing w:after="300" w:before="100"/>
+      <w:spacing w:after="120" w:before="100" w:line="240" w:lineRule="auto"/>
     </w:pPr>
     <w:rPr>
       <w:sz w:val="20"/>
       <w:szCs w:val="20"/>
+      <w:rFonts w:ascii="Arial" w:hAnsi="Arial" w:eastAsia="Arial" w:cs="Arial"/>
+      <w:color w:val="000000"/>
     </w:rPr>
   </w:style>
   <w:style w:styleId="Bibliography" w:type="paragraph">
@@ -11359,8 +11411,15 @@
     <w:basedOn w:val="Normal"/>
     <w:next w:val="Bibliography"/>
     <w:qFormat/>
-    <w:pPr/>
-    <w:rPr/>
+    <w:pPr>
+      <w:spacing w:after="60" w:line="220" w:lineRule="auto"/>
+    </w:pPr>
+    <w:rPr>
+      <w:rFonts w:ascii="Arial" w:hAnsi="Arial" w:eastAsia="Arial" w:cs="Arial"/>
+      <w:sz w:val="18"/>
+      <w:szCs w:val="18"/>
+      <w:color w:val="000000"/>
+    </w:rPr>
   </w:style>
   <w:style w:styleId="Heading1" w:type="paragraph">
     <w:name w:val="Heading 1"/>
@@ -11371,16 +11430,16 @@
     <w:pPr>
       <w:keepNext/>
       <w:keepLines/>
-      <w:spacing w:after="0" w:before="480"/>
+      <w:spacing w:after="100" w:before="260" w:line="240" w:lineRule="auto"/>
       <w:outlineLvl w:val="0"/>
     </w:pPr>
     <w:rPr>
-      <w:rFonts w:asciiTheme="majorHAnsi" w:cstheme="majorBidi" w:eastAsiaTheme="majorEastAsia" w:hAnsiTheme="majorHAnsi"/>
+      <w:rFonts w:ascii="Arial" w:hAnsi="Arial" w:eastAsia="Arial" w:cs="Arial"/>
       <w:b/>
       <w:bCs/>
-      <w:color w:themeColor="accent1" w:val="4F81BD"/>
-      <w:sz w:val="32"/>
-      <w:szCs w:val="32"/>
+      <w:color w:themeColor="accent1" w:val="000000"/>
+      <w:sz w:val="24"/>
+      <w:szCs w:val="24"/>
     </w:rPr>
   </w:style>
   <w:style w:styleId="Heading2" w:type="paragraph">
@@ -11393,16 +11452,16 @@
     <w:pPr>
       <w:keepNext/>
       <w:keepLines/>
-      <w:spacing w:after="0" w:before="200"/>
+      <w:spacing w:after="80" w:before="180" w:line="240" w:lineRule="auto"/>
       <w:outlineLvl w:val="1"/>
     </w:pPr>
     <w:rPr>
-      <w:rFonts w:asciiTheme="majorHAnsi" w:cstheme="majorBidi" w:eastAsiaTheme="majorEastAsia" w:hAnsiTheme="majorHAnsi"/>
+      <w:rFonts w:ascii="Arial" w:hAnsi="Arial" w:eastAsia="Arial" w:cs="Arial"/>
       <w:b/>
       <w:bCs/>
-      <w:color w:themeColor="accent1" w:val="4F81BD"/>
-      <w:sz w:val="28"/>
-      <w:szCs w:val="28"/>
+      <w:color w:themeColor="accent1" w:val="000000"/>
+      <w:sz w:val="22"/>
+      <w:szCs w:val="22"/>
     </w:rPr>
   </w:style>
   <w:style w:styleId="Heading3" w:type="paragraph">
@@ -11415,16 +11474,16 @@
     <w:pPr>
       <w:keepNext/>
       <w:keepLines/>
-      <w:spacing w:after="0" w:before="200"/>
+      <w:spacing w:after="60" w:before="140" w:line="240" w:lineRule="auto"/>
       <w:outlineLvl w:val="2"/>
     </w:pPr>
     <w:rPr>
-      <w:rFonts w:asciiTheme="majorHAnsi" w:cstheme="majorBidi" w:eastAsiaTheme="majorEastAsia" w:hAnsiTheme="majorHAnsi"/>
+      <w:rFonts w:ascii="Arial" w:hAnsi="Arial" w:eastAsia="Arial" w:cs="Arial"/>
       <w:b/>
       <w:bCs/>
-      <w:color w:themeColor="accent1" w:val="4F81BD"/>
-      <w:sz w:val="24"/>
-      <w:szCs w:val="24"/>
+      <w:color w:themeColor="accent1" w:val="000000"/>
+      <w:sz w:val="20"/>
+      <w:szCs w:val="20"/>
     </w:rPr>
   </w:style>
   <w:style w:styleId="Heading4" w:type="paragraph">
@@ -11441,12 +11500,12 @@
       <w:outlineLvl w:val="3"/>
     </w:pPr>
     <w:rPr>
-      <w:rFonts w:asciiTheme="majorHAnsi" w:cstheme="majorBidi" w:eastAsiaTheme="majorEastAsia" w:hAnsiTheme="majorHAnsi"/>
-      <w:i/>
+      <w:rFonts w:ascii="Arial" w:hAnsi="Arial" w:eastAsia="Arial" w:cs="Arial"/>
       <w:bCs/>
-      <w:color w:themeColor="accent1" w:val="4F81BD"/>
-      <w:sz w:val="24"/>
-      <w:szCs w:val="24"/>
+      <w:color w:themeColor="accent1" w:val="000000"/>
+      <w:sz w:val="20"/>
+      <w:szCs w:val="20"/>
+      <w:b/>
     </w:rPr>
   </w:style>
   <w:style w:styleId="Heading5" w:type="paragraph">
@@ -11463,11 +11522,12 @@
       <w:outlineLvl w:val="4"/>
     </w:pPr>
     <w:rPr>
-      <w:rFonts w:asciiTheme="majorHAnsi" w:cstheme="majorBidi" w:eastAsiaTheme="majorEastAsia" w:hAnsiTheme="majorHAnsi"/>
-      <w:iCs/>
-      <w:color w:themeColor="accent1" w:val="4F81BD"/>
-      <w:sz w:val="24"/>
-      <w:szCs w:val="24"/>
+      <w:rFonts w:ascii="Arial" w:hAnsi="Arial" w:eastAsia="Arial" w:cs="Arial"/>
+      <w:color w:themeColor="accent1" w:val="000000"/>
+      <w:sz w:val="20"/>
+      <w:szCs w:val="20"/>
+      <w:b/>
+      <w:bCs/>
     </w:rPr>
   </w:style>
   <w:style w:styleId="Heading6" w:type="paragraph">
@@ -11484,10 +11544,12 @@
       <w:outlineLvl w:val="5"/>
     </w:pPr>
     <w:rPr>
-      <w:rFonts w:asciiTheme="majorHAnsi" w:cstheme="majorBidi" w:eastAsiaTheme="majorEastAsia" w:hAnsiTheme="majorHAnsi"/>
-      <w:color w:themeColor="accent1" w:val="4F81BD"/>
-      <w:sz w:val="24"/>
-      <w:szCs w:val="24"/>
+      <w:rFonts w:ascii="Arial" w:hAnsi="Arial" w:eastAsia="Arial" w:cs="Arial"/>
+      <w:color w:themeColor="accent1" w:val="000000"/>
+      <w:sz w:val="20"/>
+      <w:szCs w:val="20"/>
+      <w:b/>
+      <w:bCs/>
     </w:rPr>
   </w:style>
   <w:style w:styleId="Heading7" w:type="paragraph">
@@ -11504,10 +11566,12 @@
       <w:outlineLvl w:val="6"/>
     </w:pPr>
     <w:rPr>
-      <w:rFonts w:asciiTheme="majorHAnsi" w:cstheme="majorBidi" w:eastAsiaTheme="majorEastAsia" w:hAnsiTheme="majorHAnsi"/>
-      <w:color w:themeColor="accent1" w:val="4F81BD"/>
-      <w:sz w:val="24"/>
-      <w:szCs w:val="24"/>
+      <w:rFonts w:ascii="Arial" w:hAnsi="Arial" w:eastAsia="Arial" w:cs="Arial"/>
+      <w:color w:themeColor="accent1" w:val="000000"/>
+      <w:sz w:val="20"/>
+      <w:szCs w:val="20"/>
+      <w:b/>
+      <w:bCs/>
     </w:rPr>
   </w:style>
   <w:style w:styleId="Heading8" w:type="paragraph">
@@ -11524,10 +11588,12 @@
       <w:outlineLvl w:val="7"/>
     </w:pPr>
     <w:rPr>
-      <w:rFonts w:asciiTheme="majorHAnsi" w:cstheme="majorBidi" w:eastAsiaTheme="majorEastAsia" w:hAnsiTheme="majorHAnsi"/>
-      <w:color w:themeColor="accent1" w:val="4F81BD"/>
-      <w:sz w:val="24"/>
-      <w:szCs w:val="24"/>
+      <w:rFonts w:ascii="Arial" w:hAnsi="Arial" w:eastAsia="Arial" w:cs="Arial"/>
+      <w:color w:themeColor="accent1" w:val="000000"/>
+      <w:sz w:val="20"/>
+      <w:szCs w:val="20"/>
+      <w:b/>
+      <w:bCs/>
     </w:rPr>
   </w:style>
   <w:style w:styleId="Heading9" w:type="paragraph">
@@ -11544,10 +11610,12 @@
       <w:outlineLvl w:val="8"/>
     </w:pPr>
     <w:rPr>
-      <w:rFonts w:asciiTheme="majorHAnsi" w:cstheme="majorBidi" w:eastAsiaTheme="majorEastAsia" w:hAnsiTheme="majorHAnsi"/>
-      <w:color w:themeColor="accent1" w:val="4F81BD"/>
-      <w:sz w:val="24"/>
-      <w:szCs w:val="24"/>
+      <w:rFonts w:ascii="Arial" w:hAnsi="Arial" w:eastAsia="Arial" w:cs="Arial"/>
+      <w:color w:themeColor="accent1" w:val="000000"/>
+      <w:sz w:val="20"/>
+      <w:szCs w:val="20"/>
+      <w:b/>
+      <w:bCs/>
     </w:rPr>
   </w:style>
   <w:style w:styleId="BlockText" w:type="paragraph">
@@ -11605,6 +11673,12 @@
         </w:tcBorders>
       </w:tcPr>
     </w:tblStylePr>
+    <w:rPr>
+      <w:rFonts w:ascii="Arial" w:hAnsi="Arial" w:eastAsia="Arial" w:cs="Arial"/>
+      <w:sz w:val="18"/>
+      <w:szCs w:val="18"/>
+      <w:color w:val="000000"/>
+    </w:rPr>
   </w:style>
   <w:style w:customStyle="1" w:styleId="DefinitionTerm" w:type="paragraph">
     <w:name w:val="Definition Term"/>
@@ -11617,6 +11691,7 @@
     </w:pPr>
     <w:rPr>
       <w:b/>
+      <w:rFonts w:ascii="Arial" w:hAnsi="Arial" w:eastAsia="Arial" w:cs="Arial"/>
     </w:rPr>
   </w:style>
   <w:style w:customStyle="1" w:styleId="Definition" w:type="paragraph">
@@ -11628,10 +11703,15 @@
     <w:basedOn w:val="Normal"/>
     <w:link w:val="BodyTextChar"/>
     <w:pPr>
-      <w:spacing w:after="120" w:before="0"/>
+      <w:spacing w:after="140" w:before="80" w:line="220" w:lineRule="auto"/>
     </w:pPr>
     <w:rPr>
       <w:i/>
+      <w:rFonts w:ascii="Arial" w:hAnsi="Arial" w:eastAsia="Arial" w:cs="Arial"/>
+      <w:sz w:val="18"/>
+      <w:szCs w:val="18"/>
+      <w:color w:val="000000"/>
+      <w:iCs/>
     </w:rPr>
   </w:style>
   <w:style w:customStyle="1" w:styleId="TableCaption" w:type="paragraph">
@@ -11639,11 +11719,31 @@
     <w:basedOn w:val="Caption"/>
     <w:pPr>
       <w:keepNext/>
+      <w:spacing w:before="80" w:after="100" w:line="220" w:lineRule="auto"/>
     </w:pPr>
+    <w:rPr>
+      <w:rFonts w:ascii="Arial" w:hAnsi="Arial" w:eastAsia="Arial" w:cs="Arial"/>
+      <w:sz w:val="18"/>
+      <w:szCs w:val="18"/>
+      <w:color w:val="000000"/>
+      <w:i/>
+      <w:iCs/>
+    </w:rPr>
   </w:style>
   <w:style w:customStyle="1" w:styleId="ImageCaption" w:type="paragraph">
     <w:name w:val="Image Caption"/>
     <w:basedOn w:val="Caption"/>
+    <w:rPr>
+      <w:rFonts w:ascii="Arial" w:hAnsi="Arial" w:eastAsia="Arial" w:cs="Arial"/>
+      <w:sz w:val="18"/>
+      <w:szCs w:val="18"/>
+      <w:color w:val="000000"/>
+      <w:i/>
+      <w:iCs/>
+    </w:rPr>
+    <w:pPr>
+      <w:spacing w:before="80" w:after="140" w:line="220" w:lineRule="auto"/>
+    </w:pPr>
   </w:style>
   <w:style w:customStyle="1" w:styleId="Figure" w:type="paragraph">
     <w:name w:val="Figure"/>
@@ -11665,7 +11765,7 @@
     <w:name w:val="Verbatim Char"/>
     <w:basedOn w:val="BodyTextChar"/>
     <w:rPr>
-      <w:rFonts w:ascii="Consolas" w:hAnsi="Consolas"/>
+      <w:rFonts w:ascii="Arial" w:hAnsi="Arial" w:eastAsia="Arial" w:cs="Arial"/>
       <w:sz w:val="22"/>
     </w:rPr>
   </w:style>
@@ -11678,6 +11778,7 @@
     <w:basedOn w:val="BodyTextChar"/>
     <w:rPr>
       <w:vertAlign w:val="superscript"/>
+      <w:rFonts w:ascii="Arial" w:hAnsi="Arial" w:eastAsia="Arial" w:cs="Arial"/>
     </w:rPr>
   </w:style>
   <w:style w:styleId="Hyperlink" w:type="character">
@@ -11685,6 +11786,7 @@
     <w:basedOn w:val="BodyTextChar"/>
     <w:rPr>
       <w:color w:themeColor="accent1" w:val="4F81BD"/>
+      <w:rFonts w:ascii="Arial" w:hAnsi="Arial" w:eastAsia="Arial" w:cs="Arial"/>
     </w:rPr>
   </w:style>
   <w:style w:styleId="TOCHeading" w:type="paragraph">
@@ -11695,14 +11797,16 @@
     <w:unhideWhenUsed/>
     <w:qFormat/>
     <w:pPr>
-      <w:spacing w:before="240" w:line="259" w:lineRule="auto"/>
+      <w:spacing w:before="260" w:line="240" w:lineRule="auto" w:after="100"/>
       <w:outlineLvl w:val="9"/>
     </w:pPr>
     <w:rPr>
-      <w:rFonts w:asciiTheme="majorHAnsi" w:cstheme="majorBidi" w:eastAsiaTheme="majorEastAsia" w:hAnsiTheme="majorHAnsi"/>
+      <w:rFonts w:ascii="Arial" w:hAnsi="Arial" w:eastAsia="Arial" w:cs="Arial"/>
       <w:b w:val="0"/>
       <w:bCs w:val="0"/>
-      <w:color w:themeColor="accent1" w:themeShade="BF" w:val="365F91"/>
+      <w:color w:themeColor="accent1" w:themeShade="BF" w:val="000000"/>
+      <w:sz w:val="24"/>
+      <w:szCs w:val="24"/>
     </w:rPr>
   </w:style>
   <w:style w:type="paragraph" w:customStyle="1" w:styleId="SourceCode">
@@ -11719,6 +11823,7 @@
     <w:rPr>
       <w:color w:val="007020"/>
       <w:b/>
+      <w:rFonts w:ascii="Arial" w:hAnsi="Arial" w:eastAsia="Arial" w:cs="Arial"/>
     </w:rPr>
   </w:style>
   <w:style w:type="character" w:customStyle="1" w:styleId="DataTypeTok">
@@ -11726,6 +11831,7 @@
     <w:basedOn w:val="VerbatimChar"/>
     <w:rPr>
       <w:color w:val="902000"/>
+      <w:rFonts w:ascii="Arial" w:hAnsi="Arial" w:eastAsia="Arial" w:cs="Arial"/>
     </w:rPr>
   </w:style>
   <w:style w:type="character" w:customStyle="1" w:styleId="DecValTok">
@@ -11733,6 +11839,7 @@
     <w:basedOn w:val="VerbatimChar"/>
     <w:rPr>
       <w:color w:val="40a070"/>
+      <w:rFonts w:ascii="Arial" w:hAnsi="Arial" w:eastAsia="Arial" w:cs="Arial"/>
     </w:rPr>
   </w:style>
   <w:style w:type="character" w:customStyle="1" w:styleId="BaseNTok">
@@ -11740,6 +11847,7 @@
     <w:basedOn w:val="VerbatimChar"/>
     <w:rPr>
       <w:color w:val="40a070"/>
+      <w:rFonts w:ascii="Arial" w:hAnsi="Arial" w:eastAsia="Arial" w:cs="Arial"/>
     </w:rPr>
   </w:style>
   <w:style w:type="character" w:customStyle="1" w:styleId="FloatTok">
@@ -11747,6 +11855,7 @@
     <w:basedOn w:val="VerbatimChar"/>
     <w:rPr>
       <w:color w:val="40a070"/>
+      <w:rFonts w:ascii="Arial" w:hAnsi="Arial" w:eastAsia="Arial" w:cs="Arial"/>
     </w:rPr>
   </w:style>
   <w:style w:type="character" w:customStyle="1" w:styleId="ConstantTok">
@@ -11754,6 +11863,7 @@
     <w:basedOn w:val="VerbatimChar"/>
     <w:rPr>
       <w:color w:val="880000"/>
+      <w:rFonts w:ascii="Arial" w:hAnsi="Arial" w:eastAsia="Arial" w:cs="Arial"/>
     </w:rPr>
   </w:style>
   <w:style w:type="character" w:customStyle="1" w:styleId="CharTok">
@@ -11761,6 +11871,7 @@
     <w:basedOn w:val="VerbatimChar"/>
     <w:rPr>
       <w:color w:val="4070a0"/>
+      <w:rFonts w:ascii="Arial" w:hAnsi="Arial" w:eastAsia="Arial" w:cs="Arial"/>
     </w:rPr>
   </w:style>
   <w:style w:type="character" w:customStyle="1" w:styleId="SpecialCharTok">
@@ -11768,6 +11879,7 @@
     <w:basedOn w:val="VerbatimChar"/>
     <w:rPr>
       <w:color w:val="4070a0"/>
+      <w:rFonts w:ascii="Arial" w:hAnsi="Arial" w:eastAsia="Arial" w:cs="Arial"/>
     </w:rPr>
   </w:style>
   <w:style w:type="character" w:customStyle="1" w:styleId="StringTok">
@@ -11775,6 +11887,7 @@
     <w:basedOn w:val="VerbatimChar"/>
     <w:rPr>
       <w:color w:val="4070a0"/>
+      <w:rFonts w:ascii="Arial" w:hAnsi="Arial" w:eastAsia="Arial" w:cs="Arial"/>
     </w:rPr>
   </w:style>
   <w:style w:type="character" w:customStyle="1" w:styleId="VerbatimStringTok">
@@ -11782,6 +11895,7 @@
     <w:basedOn w:val="VerbatimChar"/>
     <w:rPr>
       <w:color w:val="4070a0"/>
+      <w:rFonts w:ascii="Arial" w:hAnsi="Arial" w:eastAsia="Arial" w:cs="Arial"/>
     </w:rPr>
   </w:style>
   <w:style w:type="character" w:customStyle="1" w:styleId="SpecialStringTok">
@@ -11789,6 +11903,7 @@
     <w:basedOn w:val="VerbatimChar"/>
     <w:rPr>
       <w:color w:val="bb6688"/>
+      <w:rFonts w:ascii="Arial" w:hAnsi="Arial" w:eastAsia="Arial" w:cs="Arial"/>
     </w:rPr>
   </w:style>
   <w:style w:type="character" w:customStyle="1" w:styleId="ImportTok">
@@ -11797,6 +11912,7 @@
     <w:rPr>
       <w:color w:val="008000"/>
       <w:b/>
+      <w:rFonts w:ascii="Arial" w:hAnsi="Arial" w:eastAsia="Arial" w:cs="Arial"/>
     </w:rPr>
   </w:style>
   <w:style w:type="character" w:customStyle="1" w:styleId="CommentTok">
@@ -11805,6 +11921,7 @@
     <w:rPr>
       <w:color w:val="60a0b0"/>
       <w:i/>
+      <w:rFonts w:ascii="Arial" w:hAnsi="Arial" w:eastAsia="Arial" w:cs="Arial"/>
     </w:rPr>
   </w:style>
   <w:style w:type="character" w:customStyle="1" w:styleId="DocumentationTok">
@@ -11813,6 +11930,7 @@
     <w:rPr>
       <w:color w:val="ba2121"/>
       <w:i/>
+      <w:rFonts w:ascii="Arial" w:hAnsi="Arial" w:eastAsia="Arial" w:cs="Arial"/>
     </w:rPr>
   </w:style>
   <w:style w:type="character" w:customStyle="1" w:styleId="AnnotationTok">
@@ -11822,6 +11940,7 @@
       <w:color w:val="60a0b0"/>
       <w:b/>
       <w:i/>
+      <w:rFonts w:ascii="Arial" w:hAnsi="Arial" w:eastAsia="Arial" w:cs="Arial"/>
     </w:rPr>
   </w:style>
   <w:style w:type="character" w:customStyle="1" w:styleId="CommentVarTok">
@@ -11831,6 +11950,7 @@
       <w:color w:val="60a0b0"/>
       <w:b/>
       <w:i/>
+      <w:rFonts w:ascii="Arial" w:hAnsi="Arial" w:eastAsia="Arial" w:cs="Arial"/>
     </w:rPr>
   </w:style>
   <w:style w:type="character" w:customStyle="1" w:styleId="OtherTok">
@@ -11838,6 +11958,7 @@
     <w:basedOn w:val="VerbatimChar"/>
     <w:rPr>
       <w:color w:val="007020"/>
+      <w:rFonts w:ascii="Arial" w:hAnsi="Arial" w:eastAsia="Arial" w:cs="Arial"/>
     </w:rPr>
   </w:style>
   <w:style w:type="character" w:customStyle="1" w:styleId="FunctionTok">
@@ -11845,6 +11966,7 @@
     <w:basedOn w:val="VerbatimChar"/>
     <w:rPr>
       <w:color w:val="06287e"/>
+      <w:rFonts w:ascii="Arial" w:hAnsi="Arial" w:eastAsia="Arial" w:cs="Arial"/>
     </w:rPr>
   </w:style>
   <w:style w:type="character" w:customStyle="1" w:styleId="VariableTok">
@@ -11852,6 +11974,7 @@
     <w:basedOn w:val="VerbatimChar"/>
     <w:rPr>
       <w:color w:val="19177c"/>
+      <w:rFonts w:ascii="Arial" w:hAnsi="Arial" w:eastAsia="Arial" w:cs="Arial"/>
     </w:rPr>
   </w:style>
   <w:style w:type="character" w:customStyle="1" w:styleId="ControlFlowTok">
@@ -11860,6 +11983,7 @@
     <w:rPr>
       <w:color w:val="007020"/>
       <w:b/>
+      <w:rFonts w:ascii="Arial" w:hAnsi="Arial" w:eastAsia="Arial" w:cs="Arial"/>
     </w:rPr>
   </w:style>
   <w:style w:type="character" w:customStyle="1" w:styleId="OperatorTok">
@@ -11867,6 +11991,7 @@
     <w:basedOn w:val="VerbatimChar"/>
     <w:rPr>
       <w:color w:val="666666"/>
+      <w:rFonts w:ascii="Arial" w:hAnsi="Arial" w:eastAsia="Arial" w:cs="Arial"/>
     </w:rPr>
   </w:style>
   <w:style w:type="character" w:customStyle="1" w:styleId="BuiltInTok">
@@ -11874,18 +11999,22 @@
     <w:basedOn w:val="VerbatimChar"/>
     <w:rPr>
       <w:color w:val="008000"/>
+      <w:rFonts w:ascii="Arial" w:hAnsi="Arial" w:eastAsia="Arial" w:cs="Arial"/>
     </w:rPr>
   </w:style>
   <w:style w:type="character" w:customStyle="1" w:styleId="ExtensionTok">
     <w:name w:val="ExtensionTok"/>
     <w:basedOn w:val="VerbatimChar"/>
-    <w:rPr/>
+    <w:rPr>
+      <w:rFonts w:ascii="Arial" w:hAnsi="Arial" w:eastAsia="Arial" w:cs="Arial"/>
+    </w:rPr>
   </w:style>
   <w:style w:type="character" w:customStyle="1" w:styleId="PreprocessorTok">
     <w:name w:val="PreprocessorTok"/>
     <w:basedOn w:val="VerbatimChar"/>
     <w:rPr>
       <w:color w:val="bc7a00"/>
+      <w:rFonts w:ascii="Arial" w:hAnsi="Arial" w:eastAsia="Arial" w:cs="Arial"/>
     </w:rPr>
   </w:style>
   <w:style w:type="character" w:customStyle="1" w:styleId="AttributeTok">
@@ -11893,12 +12022,15 @@
     <w:basedOn w:val="VerbatimChar"/>
     <w:rPr>
       <w:color w:val="7d9029"/>
+      <w:rFonts w:ascii="Arial" w:hAnsi="Arial" w:eastAsia="Arial" w:cs="Arial"/>
     </w:rPr>
   </w:style>
   <w:style w:type="character" w:customStyle="1" w:styleId="RegionMarkerTok">
     <w:name w:val="RegionMarkerTok"/>
     <w:basedOn w:val="VerbatimChar"/>
-    <w:rPr/>
+    <w:rPr>
+      <w:rFonts w:ascii="Arial" w:hAnsi="Arial" w:eastAsia="Arial" w:cs="Arial"/>
+    </w:rPr>
   </w:style>
   <w:style w:type="character" w:customStyle="1" w:styleId="InformationTok">
     <w:name w:val="InformationTok"/>
@@ -11907,6 +12039,7 @@
       <w:color w:val="60a0b0"/>
       <w:b/>
       <w:i/>
+      <w:rFonts w:ascii="Arial" w:hAnsi="Arial" w:eastAsia="Arial" w:cs="Arial"/>
     </w:rPr>
   </w:style>
   <w:style w:type="character" w:customStyle="1" w:styleId="WarningTok">
@@ -11916,6 +12049,7 @@
       <w:color w:val="60a0b0"/>
       <w:b/>
       <w:i/>
+      <w:rFonts w:ascii="Arial" w:hAnsi="Arial" w:eastAsia="Arial" w:cs="Arial"/>
     </w:rPr>
   </w:style>
   <w:style w:type="character" w:customStyle="1" w:styleId="AlertTok">
@@ -11924,6 +12058,7 @@
     <w:rPr>
       <w:color w:val="ff0000"/>
       <w:b/>
+      <w:rFonts w:ascii="Arial" w:hAnsi="Arial" w:eastAsia="Arial" w:cs="Arial"/>
     </w:rPr>
   </w:style>
   <w:style w:type="character" w:customStyle="1" w:styleId="ErrorTok">
@@ -11932,12 +12067,15 @@
     <w:rPr>
       <w:color w:val="ff0000"/>
       <w:b/>
+      <w:rFonts w:ascii="Arial" w:hAnsi="Arial" w:eastAsia="Arial" w:cs="Arial"/>
     </w:rPr>
   </w:style>
   <w:style w:type="character" w:customStyle="1" w:styleId="NormalTok">
     <w:name w:val="NormalTok"/>
     <w:basedOn w:val="VerbatimChar"/>
-    <w:rPr/>
+    <w:rPr>
+      <w:rFonts w:ascii="Arial" w:hAnsi="Arial" w:eastAsia="Arial" w:cs="Arial"/>
+    </w:rPr>
   </w:style>
 </w:styles>
 </file>

</xml_diff>